<commit_message>
Update system design documentation
</commit_message>
<xml_diff>
--- a/documentation/SystemDesignDocumentation.docx
+++ b/documentation/SystemDesignDocumentation.docx
@@ -1,95 +1,1775 @@
 
 <file path=word/document.xml><?xml version="1.0" encoding="utf-8"?>
-<w:document xmlns:wpc="http://schemas.microsoft.com/office/word/2010/wordprocessingCanvas" xmlns:cx="http://schemas.microsoft.com/office/drawing/2014/chartex" xmlns:cx1="http://schemas.microsoft.com/office/drawing/2015/9/8/chartex" xmlns:mc="http://schemas.openxmlformats.org/markup-compatibility/2006" xmlns:o="urn:schemas-microsoft-com:office:office" xmlns:r="http://schemas.openxmlformats.org/officeDocument/2006/relationships" xmlns:m="http://schemas.openxmlformats.org/officeDocument/2006/math" xmlns:v="urn:schemas-microsoft-com:vml" xmlns:wp14="http://schemas.microsoft.com/office/word/2010/wordprocessingDrawing" xmlns:wp="http://schemas.openxmlformats.org/drawingml/2006/wordprocessingDrawing" xmlns:w10="urn:schemas-microsoft-com:office:word" xmlns:w="http://schemas.openxmlformats.org/wordprocessingml/2006/main" xmlns:w14="http://schemas.microsoft.com/office/word/2010/wordml" xmlns:w15="http://schemas.microsoft.com/office/word/2012/wordml" xmlns:w16se="http://schemas.microsoft.com/office/word/2015/wordml/symex" xmlns:wpg="http://schemas.microsoft.com/office/word/2010/wordprocessingGroup" xmlns:wpi="http://schemas.microsoft.com/office/word/2010/wordprocessingInk" xmlns:wne="http://schemas.microsoft.com/office/word/2006/wordml" xmlns:wps="http://schemas.microsoft.com/office/word/2010/wordprocessingShape" mc:Ignorable="w14 w15 w16se wp14">
+<w:document xmlns:wpc="http://schemas.microsoft.com/office/word/2010/wordprocessingCanvas" xmlns:cx="http://schemas.microsoft.com/office/drawing/2014/chartex" xmlns:cx1="http://schemas.microsoft.com/office/drawing/2015/9/8/chartex" xmlns:cx2="http://schemas.microsoft.com/office/drawing/2015/10/21/chartex" xmlns:cx3="http://schemas.microsoft.com/office/drawing/2016/5/9/chartex" xmlns:cx4="http://schemas.microsoft.com/office/drawing/2016/5/10/chartex" xmlns:cx5="http://schemas.microsoft.com/office/drawing/2016/5/11/chartex" xmlns:cx6="http://schemas.microsoft.com/office/drawing/2016/5/12/chartex" xmlns:cx7="http://schemas.microsoft.com/office/drawing/2016/5/13/chartex" xmlns:cx8="http://schemas.microsoft.com/office/drawing/2016/5/14/chartex" xmlns:mc="http://schemas.openxmlformats.org/markup-compatibility/2006" xmlns:aink="http://schemas.microsoft.com/office/drawing/2016/ink" xmlns:am3d="http://schemas.microsoft.com/office/drawing/2017/model3d" xmlns:o="urn:schemas-microsoft-com:office:office" xmlns:oel="http://schemas.microsoft.com/office/2019/extlst" xmlns:r="http://schemas.openxmlformats.org/officeDocument/2006/relationships" xmlns:m="http://schemas.openxmlformats.org/officeDocument/2006/math" xmlns:v="urn:schemas-microsoft-com:vml" xmlns:wp14="http://schemas.microsoft.com/office/word/2010/wordprocessingDrawing" xmlns:wp="http://schemas.openxmlformats.org/drawingml/2006/wordprocessingDrawing" xmlns:w10="urn:schemas-microsoft-com:office:word" xmlns:w="http://schemas.openxmlformats.org/wordprocessingml/2006/main" xmlns:w14="http://schemas.microsoft.com/office/word/2010/wordml" xmlns:w15="http://schemas.microsoft.com/office/word/2012/wordml" xmlns:w16cex="http://schemas.microsoft.com/office/word/2018/wordml/cex" xmlns:w16cid="http://schemas.microsoft.com/office/word/2016/wordml/cid" xmlns:w16="http://schemas.microsoft.com/office/word/2018/wordml" xmlns:w16du="http://schemas.microsoft.com/office/word/2023/wordml/word16du" xmlns:w16sdtdh="http://schemas.microsoft.com/office/word/2020/wordml/sdtdatahash" xmlns:w16sdtfl="http://schemas.microsoft.com/office/word/2024/wordml/sdtformatlock" xmlns:w16se="http://schemas.microsoft.com/office/word/2015/wordml/symex" xmlns:wpg="http://schemas.microsoft.com/office/word/2010/wordprocessingGroup" xmlns:wpi="http://schemas.microsoft.com/office/word/2010/wordprocessingInk" xmlns:wne="http://schemas.microsoft.com/office/word/2006/wordml" xmlns:wps="http://schemas.microsoft.com/office/word/2010/wordprocessingShape" mc:Ignorable="w14 w15 w16se w16cid w16 w16cex w16sdtdh w16sdtfl w16du wp14">
   <w:body>
     <w:p>
       <w:pPr>
         <w:jc w:val="center"/>
         <w:rPr>
+          <w:rFonts w:ascii="-webkit-standard" w:hAnsi="-webkit-standard"/>
+          <w:color w:val="000000"/>
+          <w:sz w:val="33"/>
+          <w:szCs w:val="36"/>
+        </w:rPr>
+      </w:pPr>
+      <w:r>
+        <w:rPr>
+          <w:rFonts w:ascii="-webkit-standard" w:hAnsi="-webkit-standard"/>
+          <w:noProof/>
+          <w:color w:val="000000"/>
+          <w:sz w:val="33"/>
+          <w:szCs w:val="36"/>
+        </w:rPr>
+        <w:drawing>
+          <wp:inline distT="0" distB="0" distL="0" distR="0" wp14:anchorId="5187C103" wp14:editId="6D6A4EA2">
+            <wp:extent cx="2692866" cy="2692866"/>
+            <wp:effectExtent l="0" t="0" r="0" b="0"/>
+            <wp:docPr id="1961032777" name="Picture 2"/>
+            <wp:cNvGraphicFramePr>
+              <a:graphicFrameLocks xmlns:a="http://schemas.openxmlformats.org/drawingml/2006/main" noChangeAspect="1"/>
+            </wp:cNvGraphicFramePr>
+            <a:graphic xmlns:a="http://schemas.openxmlformats.org/drawingml/2006/main">
+              <a:graphicData uri="http://schemas.openxmlformats.org/drawingml/2006/picture">
+                <pic:pic xmlns:pic="http://schemas.openxmlformats.org/drawingml/2006/picture">
+                  <pic:nvPicPr>
+                    <pic:cNvPr id="1961032777" name="Picture 1961032777"/>
+                    <pic:cNvPicPr/>
+                  </pic:nvPicPr>
+                  <pic:blipFill>
+                    <a:blip r:embed="rId6" cstate="print">
+                      <a:extLst>
+                        <a:ext uri="{28A0092B-C50C-407E-A947-70E740481C1C}">
+                          <a14:useLocalDpi xmlns:a14="http://schemas.microsoft.com/office/drawing/2010/main" val="0"/>
+                        </a:ext>
+                      </a:extLst>
+                    </a:blip>
+                    <a:stretch>
+                      <a:fillRect/>
+                    </a:stretch>
+                  </pic:blipFill>
+                  <pic:spPr>
+                    <a:xfrm>
+                      <a:off x="0" y="0"/>
+                      <a:ext cx="2716774" cy="2716774"/>
+                    </a:xfrm>
+                    <a:prstGeom prst="rect">
+                      <a:avLst/>
+                    </a:prstGeom>
+                  </pic:spPr>
+                </pic:pic>
+              </a:graphicData>
+            </a:graphic>
+          </wp:inline>
+        </w:drawing>
+      </w:r>
+    </w:p>
+    <w:p>
+      <w:pPr>
+        <w:rPr>
+          <w:rFonts w:ascii="-webkit-standard" w:hAnsi="-webkit-standard"/>
+          <w:color w:val="000000"/>
+          <w:sz w:val="33"/>
+          <w:szCs w:val="36"/>
+        </w:rPr>
+      </w:pPr>
+    </w:p>
+    <w:p>
+      <w:pPr>
+        <w:rPr>
+          <w:rFonts w:ascii="-webkit-standard" w:hAnsi="-webkit-standard"/>
+          <w:color w:val="000000"/>
+          <w:sz w:val="33"/>
+          <w:szCs w:val="36"/>
+        </w:rPr>
+      </w:pPr>
+    </w:p>
+    <w:p>
+      <w:pPr>
+        <w:jc w:val="center"/>
+        <w:rPr>
+          <w:rFonts w:ascii="-webkit-standard" w:hAnsi="-webkit-standard"/>
+          <w:color w:val="000000"/>
+          <w:sz w:val="33"/>
+          <w:szCs w:val="36"/>
+        </w:rPr>
+      </w:pPr>
+      <w:proofErr w:type="spellStart"/>
+      <w:r>
+        <w:rPr>
+          <w:rFonts w:ascii="-webkit-standard" w:hAnsi="-webkit-standard"/>
+          <w:color w:val="000000"/>
+          <w:sz w:val="33"/>
+          <w:szCs w:val="36"/>
+        </w:rPr>
+        <w:t>EduCode</w:t>
+      </w:r>
+      <w:proofErr w:type="spellEnd"/>
+      <w:r>
+        <w:rPr>
+          <w:rFonts w:ascii="-webkit-standard" w:hAnsi="-webkit-standard"/>
+          <w:color w:val="000000"/>
+          <w:sz w:val="33"/>
+          <w:szCs w:val="36"/>
+        </w:rPr>
+        <w:t xml:space="preserve"> – AI Programming Task Generator</w:t>
+      </w:r>
+    </w:p>
+    <w:p>
+      <w:pPr>
+        <w:jc w:val="center"/>
+        <w:rPr>
+          <w:rFonts w:cs="Arial"/>
+          <w:sz w:val="36"/>
+          <w:szCs w:val="36"/>
+        </w:rPr>
+      </w:pPr>
+      <w:r>
+        <w:rPr>
+          <w:rFonts w:ascii="-webkit-standard" w:hAnsi="-webkit-standard"/>
+          <w:color w:val="000000"/>
+          <w:sz w:val="27"/>
+          <w:szCs w:val="27"/>
+        </w:rPr>
+        <w:t>System Design Documentation</w:t>
+      </w:r>
+    </w:p>
+    <w:p>
+      <w:pPr>
+        <w:rPr>
+          <w:rFonts w:cs="Arial"/>
+          <w:szCs w:val="24"/>
+        </w:rPr>
+      </w:pPr>
+    </w:p>
+    <w:p>
+      <w:pPr>
+        <w:rPr>
+          <w:rFonts w:cs="Arial"/>
+          <w:szCs w:val="24"/>
+        </w:rPr>
+      </w:pPr>
+    </w:p>
+    <w:p>
+      <w:pPr>
+        <w:rPr>
+          <w:rFonts w:cs="Arial"/>
+          <w:szCs w:val="24"/>
+        </w:rPr>
+      </w:pPr>
+    </w:p>
+    <w:p>
+      <w:pPr>
+        <w:rPr>
+          <w:rFonts w:cs="Arial"/>
+          <w:szCs w:val="24"/>
+        </w:rPr>
+      </w:pPr>
+    </w:p>
+    <w:p>
+      <w:pPr>
+        <w:rPr>
+          <w:rFonts w:cs="Arial"/>
+          <w:szCs w:val="24"/>
+        </w:rPr>
+      </w:pPr>
+    </w:p>
+    <w:p>
+      <w:pPr>
+        <w:rPr>
+          <w:rFonts w:cs="Arial"/>
+          <w:szCs w:val="24"/>
+        </w:rPr>
+      </w:pPr>
+    </w:p>
+    <w:p>
+      <w:pPr>
+        <w:rPr>
+          <w:rFonts w:cs="Arial"/>
+          <w:szCs w:val="24"/>
+        </w:rPr>
+      </w:pPr>
+    </w:p>
+    <w:p>
+      <w:pPr>
+        <w:rPr>
+          <w:rFonts w:cs="Arial"/>
+          <w:szCs w:val="24"/>
+        </w:rPr>
+      </w:pPr>
+    </w:p>
+    <w:p>
+      <w:pPr>
+        <w:rPr>
+          <w:rFonts w:cs="Arial"/>
+          <w:szCs w:val="24"/>
+        </w:rPr>
+      </w:pPr>
+    </w:p>
+    <w:p>
+      <w:pPr>
+        <w:rPr>
+          <w:rFonts w:ascii="-webkit-standard" w:hAnsi="-webkit-standard"/>
+          <w:color w:val="000000"/>
+          <w:sz w:val="23"/>
+        </w:rPr>
+      </w:pPr>
+      <w:r>
+        <w:rPr>
+          <w:rFonts w:ascii="-webkit-standard" w:hAnsi="-webkit-standard"/>
+          <w:color w:val="000000"/>
+          <w:sz w:val="23"/>
+        </w:rPr>
+        <w:t>Project members:</w:t>
+      </w:r>
+      <w:r>
+        <w:rPr>
+          <w:rFonts w:ascii="-webkit-standard" w:hAnsi="-webkit-standard"/>
+          <w:color w:val="000000"/>
+          <w:sz w:val="23"/>
+        </w:rPr>
+        <w:t xml:space="preserve"> </w:t>
+      </w:r>
+      <w:r>
+        <w:rPr>
+          <w:rFonts w:ascii="-webkit-standard" w:hAnsi="-webkit-standard"/>
+          <w:color w:val="000000"/>
+          <w:sz w:val="23"/>
+        </w:rPr>
+        <w:t xml:space="preserve">Eleonora </w:t>
+      </w:r>
+      <w:proofErr w:type="spellStart"/>
+      <w:r>
+        <w:rPr>
+          <w:rFonts w:ascii="-webkit-standard" w:hAnsi="-webkit-standard"/>
+          <w:color w:val="000000"/>
+          <w:sz w:val="23"/>
+        </w:rPr>
+        <w:t>Stankovska</w:t>
+      </w:r>
+      <w:proofErr w:type="spellEnd"/>
+      <w:r>
+        <w:rPr>
+          <w:rFonts w:ascii="-webkit-standard" w:hAnsi="-webkit-standard"/>
+          <w:color w:val="000000"/>
+          <w:sz w:val="23"/>
+        </w:rPr>
+        <w:t xml:space="preserve">, </w:t>
+      </w:r>
+      <w:r>
+        <w:rPr>
+          <w:rFonts w:ascii="-webkit-standard" w:hAnsi="-webkit-standard"/>
+          <w:color w:val="000000"/>
+          <w:sz w:val="23"/>
+        </w:rPr>
+        <w:t>Mila Nastoska</w:t>
+      </w:r>
+      <w:r>
+        <w:rPr>
+          <w:rFonts w:ascii="-webkit-standard" w:hAnsi="-webkit-standard"/>
+          <w:color w:val="000000"/>
+          <w:sz w:val="23"/>
+        </w:rPr>
+        <w:t>, Neja Kašman</w:t>
+      </w:r>
+    </w:p>
+    <w:p>
+      <w:pPr>
+        <w:rPr>
+          <w:rFonts w:ascii="-webkit-standard" w:hAnsi="-webkit-standard"/>
+          <w:color w:val="000000"/>
+          <w:sz w:val="23"/>
+        </w:rPr>
+      </w:pPr>
+      <w:r>
+        <w:rPr>
+          <w:rFonts w:ascii="-webkit-standard" w:hAnsi="-webkit-standard"/>
+          <w:color w:val="000000"/>
+          <w:sz w:val="23"/>
+        </w:rPr>
+        <w:t>Maribor 2026</w:t>
+      </w:r>
+    </w:p>
+    <w:p>
+      <w:pPr>
+        <w:spacing w:after="160" w:line="259" w:lineRule="auto"/>
+        <w:rPr>
+          <w:rFonts w:cs="Arial"/>
+          <w:szCs w:val="24"/>
+        </w:rPr>
+      </w:pPr>
+      <w:r>
+        <w:rPr>
+          <w:rFonts w:cs="Arial"/>
+          <w:szCs w:val="24"/>
+        </w:rPr>
+        <w:br w:type="page"/>
+      </w:r>
+    </w:p>
+    <w:sdt>
+      <w:sdtPr>
+        <w:id w:val="40101397"/>
+        <w:docPartObj>
+          <w:docPartGallery w:val="Table of Contents"/>
+          <w:docPartUnique/>
+        </w:docPartObj>
+      </w:sdtPr>
+      <w:sdtEndPr>
+        <w:rPr>
           <w:b/>
-          <w:sz w:val="28"/>
-          <w:szCs w:val="28"/>
-        </w:rPr>
-      </w:pPr>
-      <w:r>
-        <w:rPr>
-          <w:b/>
-          <w:sz w:val="28"/>
-          <w:szCs w:val="28"/>
-        </w:rPr>
-        <w:t>EduCode – System Design Documentation</w:t>
-      </w:r>
-    </w:p>
-    <w:p>
-      <w:pPr>
-        <w:rPr>
-          <w:rFonts w:cs="Arial"/>
-          <w:szCs w:val="24"/>
-        </w:rPr>
-      </w:pPr>
-    </w:p>
-    <w:p>
-      <w:pPr>
-        <w:rPr>
-          <w:rFonts w:cs="Arial"/>
-          <w:szCs w:val="24"/>
-        </w:rPr>
-      </w:pPr>
-      <w:r>
-        <w:rPr>
-          <w:rFonts w:cs="Arial"/>
-          <w:szCs w:val="24"/>
-        </w:rPr>
-        <w:t>This document presents the core design and interface components of the EduCode AI Task Generator system. It includes the Use Case Diagram (DPU), Entity Relationship Diagram (ERD), Architecture Design, and system mockups.</w:t>
-      </w:r>
-    </w:p>
+          <w:bCs/>
+          <w:noProof/>
+        </w:rPr>
+      </w:sdtEndPr>
+      <w:sdtContent>
+        <w:p>
+          <w:r>
+            <w:t>Table of Contents</w:t>
+          </w:r>
+        </w:p>
+        <w:p>
+          <w:pPr>
+            <w:pStyle w:val="TOC1"/>
+            <w:tabs>
+              <w:tab w:val="left" w:pos="480"/>
+              <w:tab w:val="right" w:leader="dot" w:pos="8630"/>
+            </w:tabs>
+            <w:rPr>
+              <w:rFonts w:eastAsiaTheme="minorEastAsia" w:cstheme="minorBidi"/>
+              <w:b w:val="0"/>
+              <w:bCs w:val="0"/>
+              <w:i w:val="0"/>
+              <w:iCs w:val="0"/>
+              <w:noProof/>
+              <w:kern w:val="2"/>
+              <w14:ligatures w14:val="standardContextual"/>
+            </w:rPr>
+          </w:pPr>
+          <w:r>
+            <w:rPr>
+              <w:b w:val="0"/>
+              <w:bCs w:val="0"/>
+            </w:rPr>
+            <w:fldChar w:fldCharType="begin"/>
+          </w:r>
+          <w:r>
+            <w:instrText xml:space="preserve"> TOC \o "1-3" \h \z \u </w:instrText>
+          </w:r>
+          <w:r>
+            <w:rPr>
+              <w:b w:val="0"/>
+              <w:bCs w:val="0"/>
+            </w:rPr>
+            <w:fldChar w:fldCharType="separate"/>
+          </w:r>
+          <w:hyperlink w:anchor="_Toc229761532" w:history="1">
+            <w:r>
+              <w:rPr>
+                <w:rStyle w:val="Hyperlink"/>
+                <w:noProof/>
+              </w:rPr>
+              <w:t>1</w:t>
+            </w:r>
+            <w:r>
+              <w:rPr>
+                <w:rFonts w:eastAsiaTheme="minorEastAsia" w:cstheme="minorBidi"/>
+                <w:b w:val="0"/>
+                <w:bCs w:val="0"/>
+                <w:i w:val="0"/>
+                <w:iCs w:val="0"/>
+                <w:noProof/>
+                <w:kern w:val="2"/>
+                <w14:ligatures w14:val="standardContextual"/>
+              </w:rPr>
+              <w:tab/>
+            </w:r>
+            <w:r>
+              <w:rPr>
+                <w:rStyle w:val="Hyperlink"/>
+                <w:noProof/>
+              </w:rPr>
+              <w:t>Introduction</w:t>
+            </w:r>
+            <w:r>
+              <w:rPr>
+                <w:noProof/>
+                <w:webHidden/>
+              </w:rPr>
+              <w:tab/>
+            </w:r>
+            <w:r>
+              <w:rPr>
+                <w:noProof/>
+                <w:webHidden/>
+              </w:rPr>
+              <w:fldChar w:fldCharType="begin"/>
+            </w:r>
+            <w:r>
+              <w:rPr>
+                <w:noProof/>
+                <w:webHidden/>
+              </w:rPr>
+              <w:instrText xml:space="preserve"> PAGEREF _Toc229761532 \h </w:instrText>
+            </w:r>
+            <w:r>
+              <w:rPr>
+                <w:noProof/>
+                <w:webHidden/>
+              </w:rPr>
+            </w:r>
+            <w:r>
+              <w:rPr>
+                <w:noProof/>
+                <w:webHidden/>
+              </w:rPr>
+              <w:fldChar w:fldCharType="separate"/>
+            </w:r>
+            <w:r>
+              <w:rPr>
+                <w:noProof/>
+                <w:webHidden/>
+              </w:rPr>
+              <w:t>3</w:t>
+            </w:r>
+            <w:r>
+              <w:rPr>
+                <w:noProof/>
+                <w:webHidden/>
+              </w:rPr>
+              <w:fldChar w:fldCharType="end"/>
+            </w:r>
+          </w:hyperlink>
+        </w:p>
+        <w:p>
+          <w:pPr>
+            <w:pStyle w:val="TOC1"/>
+            <w:tabs>
+              <w:tab w:val="left" w:pos="480"/>
+              <w:tab w:val="right" w:leader="dot" w:pos="8630"/>
+            </w:tabs>
+            <w:rPr>
+              <w:rFonts w:eastAsiaTheme="minorEastAsia" w:cstheme="minorBidi"/>
+              <w:b w:val="0"/>
+              <w:bCs w:val="0"/>
+              <w:i w:val="0"/>
+              <w:iCs w:val="0"/>
+              <w:noProof/>
+              <w:kern w:val="2"/>
+              <w14:ligatures w14:val="standardContextual"/>
+            </w:rPr>
+          </w:pPr>
+          <w:hyperlink w:anchor="_Toc229761533" w:history="1">
+            <w:r>
+              <w:rPr>
+                <w:rStyle w:val="Hyperlink"/>
+                <w:noProof/>
+              </w:rPr>
+              <w:t>2</w:t>
+            </w:r>
+            <w:r>
+              <w:rPr>
+                <w:rFonts w:eastAsiaTheme="minorEastAsia" w:cstheme="minorBidi"/>
+                <w:b w:val="0"/>
+                <w:bCs w:val="0"/>
+                <w:i w:val="0"/>
+                <w:iCs w:val="0"/>
+                <w:noProof/>
+                <w:kern w:val="2"/>
+                <w14:ligatures w14:val="standardContextual"/>
+              </w:rPr>
+              <w:tab/>
+            </w:r>
+            <w:r>
+              <w:rPr>
+                <w:rStyle w:val="Hyperlink"/>
+                <w:noProof/>
+              </w:rPr>
+              <w:t>Project Goals</w:t>
+            </w:r>
+            <w:r>
+              <w:rPr>
+                <w:noProof/>
+                <w:webHidden/>
+              </w:rPr>
+              <w:tab/>
+            </w:r>
+            <w:r>
+              <w:rPr>
+                <w:noProof/>
+                <w:webHidden/>
+              </w:rPr>
+              <w:fldChar w:fldCharType="begin"/>
+            </w:r>
+            <w:r>
+              <w:rPr>
+                <w:noProof/>
+                <w:webHidden/>
+              </w:rPr>
+              <w:instrText xml:space="preserve"> PAGEREF _Toc229761533 \h </w:instrText>
+            </w:r>
+            <w:r>
+              <w:rPr>
+                <w:noProof/>
+                <w:webHidden/>
+              </w:rPr>
+            </w:r>
+            <w:r>
+              <w:rPr>
+                <w:noProof/>
+                <w:webHidden/>
+              </w:rPr>
+              <w:fldChar w:fldCharType="separate"/>
+            </w:r>
+            <w:r>
+              <w:rPr>
+                <w:noProof/>
+                <w:webHidden/>
+              </w:rPr>
+              <w:t>4</w:t>
+            </w:r>
+            <w:r>
+              <w:rPr>
+                <w:noProof/>
+                <w:webHidden/>
+              </w:rPr>
+              <w:fldChar w:fldCharType="end"/>
+            </w:r>
+          </w:hyperlink>
+        </w:p>
+        <w:p>
+          <w:pPr>
+            <w:pStyle w:val="TOC1"/>
+            <w:tabs>
+              <w:tab w:val="left" w:pos="480"/>
+              <w:tab w:val="right" w:leader="dot" w:pos="8630"/>
+            </w:tabs>
+            <w:rPr>
+              <w:rFonts w:eastAsiaTheme="minorEastAsia" w:cstheme="minorBidi"/>
+              <w:b w:val="0"/>
+              <w:bCs w:val="0"/>
+              <w:i w:val="0"/>
+              <w:iCs w:val="0"/>
+              <w:noProof/>
+              <w:kern w:val="2"/>
+              <w14:ligatures w14:val="standardContextual"/>
+            </w:rPr>
+          </w:pPr>
+          <w:hyperlink w:anchor="_Toc229761534" w:history="1">
+            <w:r>
+              <w:rPr>
+                <w:rStyle w:val="Hyperlink"/>
+                <w:noProof/>
+              </w:rPr>
+              <w:t>3</w:t>
+            </w:r>
+            <w:r>
+              <w:rPr>
+                <w:rFonts w:eastAsiaTheme="minorEastAsia" w:cstheme="minorBidi"/>
+                <w:b w:val="0"/>
+                <w:bCs w:val="0"/>
+                <w:i w:val="0"/>
+                <w:iCs w:val="0"/>
+                <w:noProof/>
+                <w:kern w:val="2"/>
+                <w14:ligatures w14:val="standardContextual"/>
+              </w:rPr>
+              <w:tab/>
+            </w:r>
+            <w:r>
+              <w:rPr>
+                <w:rStyle w:val="Hyperlink"/>
+                <w:noProof/>
+              </w:rPr>
+              <w:t>Use Case Diagram (DPU)</w:t>
+            </w:r>
+            <w:r>
+              <w:rPr>
+                <w:noProof/>
+                <w:webHidden/>
+              </w:rPr>
+              <w:tab/>
+            </w:r>
+            <w:r>
+              <w:rPr>
+                <w:noProof/>
+                <w:webHidden/>
+              </w:rPr>
+              <w:fldChar w:fldCharType="begin"/>
+            </w:r>
+            <w:r>
+              <w:rPr>
+                <w:noProof/>
+                <w:webHidden/>
+              </w:rPr>
+              <w:instrText xml:space="preserve"> PAGEREF _Toc229761534 \h </w:instrText>
+            </w:r>
+            <w:r>
+              <w:rPr>
+                <w:noProof/>
+                <w:webHidden/>
+              </w:rPr>
+            </w:r>
+            <w:r>
+              <w:rPr>
+                <w:noProof/>
+                <w:webHidden/>
+              </w:rPr>
+              <w:fldChar w:fldCharType="separate"/>
+            </w:r>
+            <w:r>
+              <w:rPr>
+                <w:noProof/>
+                <w:webHidden/>
+              </w:rPr>
+              <w:t>4</w:t>
+            </w:r>
+            <w:r>
+              <w:rPr>
+                <w:noProof/>
+                <w:webHidden/>
+              </w:rPr>
+              <w:fldChar w:fldCharType="end"/>
+            </w:r>
+          </w:hyperlink>
+        </w:p>
+        <w:p>
+          <w:pPr>
+            <w:pStyle w:val="TOC1"/>
+            <w:tabs>
+              <w:tab w:val="left" w:pos="480"/>
+              <w:tab w:val="right" w:leader="dot" w:pos="8630"/>
+            </w:tabs>
+            <w:rPr>
+              <w:rFonts w:eastAsiaTheme="minorEastAsia" w:cstheme="minorBidi"/>
+              <w:b w:val="0"/>
+              <w:bCs w:val="0"/>
+              <w:i w:val="0"/>
+              <w:iCs w:val="0"/>
+              <w:noProof/>
+              <w:kern w:val="2"/>
+              <w14:ligatures w14:val="standardContextual"/>
+            </w:rPr>
+          </w:pPr>
+          <w:hyperlink w:anchor="_Toc229761535" w:history="1">
+            <w:r>
+              <w:rPr>
+                <w:rStyle w:val="Hyperlink"/>
+                <w:noProof/>
+              </w:rPr>
+              <w:t>4</w:t>
+            </w:r>
+            <w:r>
+              <w:rPr>
+                <w:rFonts w:eastAsiaTheme="minorEastAsia" w:cstheme="minorBidi"/>
+                <w:b w:val="0"/>
+                <w:bCs w:val="0"/>
+                <w:i w:val="0"/>
+                <w:iCs w:val="0"/>
+                <w:noProof/>
+                <w:kern w:val="2"/>
+                <w14:ligatures w14:val="standardContextual"/>
+              </w:rPr>
+              <w:tab/>
+            </w:r>
+            <w:r>
+              <w:rPr>
+                <w:rStyle w:val="Hyperlink"/>
+                <w:noProof/>
+              </w:rPr>
+              <w:t>Entity Relationship Diagram (ERD)</w:t>
+            </w:r>
+            <w:r>
+              <w:rPr>
+                <w:noProof/>
+                <w:webHidden/>
+              </w:rPr>
+              <w:tab/>
+            </w:r>
+            <w:r>
+              <w:rPr>
+                <w:noProof/>
+                <w:webHidden/>
+              </w:rPr>
+              <w:fldChar w:fldCharType="begin"/>
+            </w:r>
+            <w:r>
+              <w:rPr>
+                <w:noProof/>
+                <w:webHidden/>
+              </w:rPr>
+              <w:instrText xml:space="preserve"> PAGEREF _Toc229761535 \h </w:instrText>
+            </w:r>
+            <w:r>
+              <w:rPr>
+                <w:noProof/>
+                <w:webHidden/>
+              </w:rPr>
+            </w:r>
+            <w:r>
+              <w:rPr>
+                <w:noProof/>
+                <w:webHidden/>
+              </w:rPr>
+              <w:fldChar w:fldCharType="separate"/>
+            </w:r>
+            <w:r>
+              <w:rPr>
+                <w:noProof/>
+                <w:webHidden/>
+              </w:rPr>
+              <w:t>5</w:t>
+            </w:r>
+            <w:r>
+              <w:rPr>
+                <w:noProof/>
+                <w:webHidden/>
+              </w:rPr>
+              <w:fldChar w:fldCharType="end"/>
+            </w:r>
+          </w:hyperlink>
+        </w:p>
+        <w:p>
+          <w:pPr>
+            <w:pStyle w:val="TOC1"/>
+            <w:tabs>
+              <w:tab w:val="left" w:pos="480"/>
+              <w:tab w:val="right" w:leader="dot" w:pos="8630"/>
+            </w:tabs>
+            <w:rPr>
+              <w:rFonts w:eastAsiaTheme="minorEastAsia" w:cstheme="minorBidi"/>
+              <w:b w:val="0"/>
+              <w:bCs w:val="0"/>
+              <w:i w:val="0"/>
+              <w:iCs w:val="0"/>
+              <w:noProof/>
+              <w:kern w:val="2"/>
+              <w14:ligatures w14:val="standardContextual"/>
+            </w:rPr>
+          </w:pPr>
+          <w:hyperlink w:anchor="_Toc229761536" w:history="1">
+            <w:r>
+              <w:rPr>
+                <w:rStyle w:val="Hyperlink"/>
+                <w:noProof/>
+              </w:rPr>
+              <w:t>5</w:t>
+            </w:r>
+            <w:r>
+              <w:rPr>
+                <w:rFonts w:eastAsiaTheme="minorEastAsia" w:cstheme="minorBidi"/>
+                <w:b w:val="0"/>
+                <w:bCs w:val="0"/>
+                <w:i w:val="0"/>
+                <w:iCs w:val="0"/>
+                <w:noProof/>
+                <w:kern w:val="2"/>
+                <w14:ligatures w14:val="standardContextual"/>
+              </w:rPr>
+              <w:tab/>
+            </w:r>
+            <w:r>
+              <w:rPr>
+                <w:rStyle w:val="Hyperlink"/>
+                <w:noProof/>
+              </w:rPr>
+              <w:t>Architecture Design</w:t>
+            </w:r>
+            <w:r>
+              <w:rPr>
+                <w:noProof/>
+                <w:webHidden/>
+              </w:rPr>
+              <w:tab/>
+            </w:r>
+            <w:r>
+              <w:rPr>
+                <w:noProof/>
+                <w:webHidden/>
+              </w:rPr>
+              <w:fldChar w:fldCharType="begin"/>
+            </w:r>
+            <w:r>
+              <w:rPr>
+                <w:noProof/>
+                <w:webHidden/>
+              </w:rPr>
+              <w:instrText xml:space="preserve"> PAGEREF _Toc229761536 \h </w:instrText>
+            </w:r>
+            <w:r>
+              <w:rPr>
+                <w:noProof/>
+                <w:webHidden/>
+              </w:rPr>
+            </w:r>
+            <w:r>
+              <w:rPr>
+                <w:noProof/>
+                <w:webHidden/>
+              </w:rPr>
+              <w:fldChar w:fldCharType="separate"/>
+            </w:r>
+            <w:r>
+              <w:rPr>
+                <w:noProof/>
+                <w:webHidden/>
+              </w:rPr>
+              <w:t>6</w:t>
+            </w:r>
+            <w:r>
+              <w:rPr>
+                <w:noProof/>
+                <w:webHidden/>
+              </w:rPr>
+              <w:fldChar w:fldCharType="end"/>
+            </w:r>
+          </w:hyperlink>
+        </w:p>
+        <w:p>
+          <w:pPr>
+            <w:pStyle w:val="TOC1"/>
+            <w:tabs>
+              <w:tab w:val="left" w:pos="480"/>
+              <w:tab w:val="right" w:leader="dot" w:pos="8630"/>
+            </w:tabs>
+            <w:rPr>
+              <w:rFonts w:eastAsiaTheme="minorEastAsia" w:cstheme="minorBidi"/>
+              <w:b w:val="0"/>
+              <w:bCs w:val="0"/>
+              <w:i w:val="0"/>
+              <w:iCs w:val="0"/>
+              <w:noProof/>
+              <w:kern w:val="2"/>
+              <w14:ligatures w14:val="standardContextual"/>
+            </w:rPr>
+          </w:pPr>
+          <w:hyperlink w:anchor="_Toc229761537" w:history="1">
+            <w:r>
+              <w:rPr>
+                <w:rStyle w:val="Hyperlink"/>
+                <w:noProof/>
+              </w:rPr>
+              <w:t>6</w:t>
+            </w:r>
+            <w:r>
+              <w:rPr>
+                <w:rFonts w:eastAsiaTheme="minorEastAsia" w:cstheme="minorBidi"/>
+                <w:b w:val="0"/>
+                <w:bCs w:val="0"/>
+                <w:i w:val="0"/>
+                <w:iCs w:val="0"/>
+                <w:noProof/>
+                <w:kern w:val="2"/>
+                <w14:ligatures w14:val="standardContextual"/>
+              </w:rPr>
+              <w:tab/>
+            </w:r>
+            <w:r>
+              <w:rPr>
+                <w:rStyle w:val="Hyperlink"/>
+                <w:noProof/>
+              </w:rPr>
+              <w:t>System Mockups</w:t>
+            </w:r>
+            <w:r>
+              <w:rPr>
+                <w:noProof/>
+                <w:webHidden/>
+              </w:rPr>
+              <w:tab/>
+            </w:r>
+            <w:r>
+              <w:rPr>
+                <w:noProof/>
+                <w:webHidden/>
+              </w:rPr>
+              <w:fldChar w:fldCharType="begin"/>
+            </w:r>
+            <w:r>
+              <w:rPr>
+                <w:noProof/>
+                <w:webHidden/>
+              </w:rPr>
+              <w:instrText xml:space="preserve"> PAGEREF _Toc229761537 \h </w:instrText>
+            </w:r>
+            <w:r>
+              <w:rPr>
+                <w:noProof/>
+                <w:webHidden/>
+              </w:rPr>
+            </w:r>
+            <w:r>
+              <w:rPr>
+                <w:noProof/>
+                <w:webHidden/>
+              </w:rPr>
+              <w:fldChar w:fldCharType="separate"/>
+            </w:r>
+            <w:r>
+              <w:rPr>
+                <w:noProof/>
+                <w:webHidden/>
+              </w:rPr>
+              <w:t>7</w:t>
+            </w:r>
+            <w:r>
+              <w:rPr>
+                <w:noProof/>
+                <w:webHidden/>
+              </w:rPr>
+              <w:fldChar w:fldCharType="end"/>
+            </w:r>
+          </w:hyperlink>
+        </w:p>
+        <w:p>
+          <w:pPr>
+            <w:pStyle w:val="TOC2"/>
+            <w:tabs>
+              <w:tab w:val="left" w:pos="960"/>
+              <w:tab w:val="right" w:leader="dot" w:pos="8630"/>
+            </w:tabs>
+            <w:rPr>
+              <w:rFonts w:eastAsiaTheme="minorEastAsia" w:cstheme="minorBidi"/>
+              <w:b w:val="0"/>
+              <w:bCs w:val="0"/>
+              <w:noProof/>
+              <w:kern w:val="2"/>
+              <w:sz w:val="24"/>
+              <w:szCs w:val="24"/>
+              <w14:ligatures w14:val="standardContextual"/>
+            </w:rPr>
+          </w:pPr>
+          <w:hyperlink w:anchor="_Toc229761538" w:history="1">
+            <w:r>
+              <w:rPr>
+                <w:rStyle w:val="Hyperlink"/>
+                <w:noProof/>
+              </w:rPr>
+              <w:t>6.1</w:t>
+            </w:r>
+            <w:r>
+              <w:rPr>
+                <w:rFonts w:eastAsiaTheme="minorEastAsia" w:cstheme="minorBidi"/>
+                <w:b w:val="0"/>
+                <w:bCs w:val="0"/>
+                <w:noProof/>
+                <w:kern w:val="2"/>
+                <w:sz w:val="24"/>
+                <w:szCs w:val="24"/>
+                <w14:ligatures w14:val="standardContextual"/>
+              </w:rPr>
+              <w:tab/>
+            </w:r>
+            <w:r>
+              <w:rPr>
+                <w:rStyle w:val="Hyperlink"/>
+                <w:noProof/>
+              </w:rPr>
+              <w:t>Generate task</w:t>
+            </w:r>
+            <w:r>
+              <w:rPr>
+                <w:noProof/>
+                <w:webHidden/>
+              </w:rPr>
+              <w:tab/>
+            </w:r>
+            <w:r>
+              <w:rPr>
+                <w:noProof/>
+                <w:webHidden/>
+              </w:rPr>
+              <w:fldChar w:fldCharType="begin"/>
+            </w:r>
+            <w:r>
+              <w:rPr>
+                <w:noProof/>
+                <w:webHidden/>
+              </w:rPr>
+              <w:instrText xml:space="preserve"> PAGEREF _Toc229761538 \h </w:instrText>
+            </w:r>
+            <w:r>
+              <w:rPr>
+                <w:noProof/>
+                <w:webHidden/>
+              </w:rPr>
+            </w:r>
+            <w:r>
+              <w:rPr>
+                <w:noProof/>
+                <w:webHidden/>
+              </w:rPr>
+              <w:fldChar w:fldCharType="separate"/>
+            </w:r>
+            <w:r>
+              <w:rPr>
+                <w:noProof/>
+                <w:webHidden/>
+              </w:rPr>
+              <w:t>7</w:t>
+            </w:r>
+            <w:r>
+              <w:rPr>
+                <w:noProof/>
+                <w:webHidden/>
+              </w:rPr>
+              <w:fldChar w:fldCharType="end"/>
+            </w:r>
+          </w:hyperlink>
+        </w:p>
+        <w:p>
+          <w:pPr>
+            <w:pStyle w:val="TOC2"/>
+            <w:tabs>
+              <w:tab w:val="left" w:pos="960"/>
+              <w:tab w:val="right" w:leader="dot" w:pos="8630"/>
+            </w:tabs>
+            <w:rPr>
+              <w:rFonts w:eastAsiaTheme="minorEastAsia" w:cstheme="minorBidi"/>
+              <w:b w:val="0"/>
+              <w:bCs w:val="0"/>
+              <w:noProof/>
+              <w:kern w:val="2"/>
+              <w:sz w:val="24"/>
+              <w:szCs w:val="24"/>
+              <w14:ligatures w14:val="standardContextual"/>
+            </w:rPr>
+          </w:pPr>
+          <w:hyperlink w:anchor="_Toc229761539" w:history="1">
+            <w:r>
+              <w:rPr>
+                <w:rStyle w:val="Hyperlink"/>
+                <w:noProof/>
+              </w:rPr>
+              <w:t>6.2</w:t>
+            </w:r>
+            <w:r>
+              <w:rPr>
+                <w:rFonts w:eastAsiaTheme="minorEastAsia" w:cstheme="minorBidi"/>
+                <w:b w:val="0"/>
+                <w:bCs w:val="0"/>
+                <w:noProof/>
+                <w:kern w:val="2"/>
+                <w:sz w:val="24"/>
+                <w:szCs w:val="24"/>
+                <w14:ligatures w14:val="standardContextual"/>
+              </w:rPr>
+              <w:tab/>
+            </w:r>
+            <w:r>
+              <w:rPr>
+                <w:rStyle w:val="Hyperlink"/>
+                <w:noProof/>
+              </w:rPr>
+              <w:t>Templates</w:t>
+            </w:r>
+            <w:r>
+              <w:rPr>
+                <w:noProof/>
+                <w:webHidden/>
+              </w:rPr>
+              <w:tab/>
+            </w:r>
+            <w:r>
+              <w:rPr>
+                <w:noProof/>
+                <w:webHidden/>
+              </w:rPr>
+              <w:fldChar w:fldCharType="begin"/>
+            </w:r>
+            <w:r>
+              <w:rPr>
+                <w:noProof/>
+                <w:webHidden/>
+              </w:rPr>
+              <w:instrText xml:space="preserve"> PAGEREF _Toc229761539 \h </w:instrText>
+            </w:r>
+            <w:r>
+              <w:rPr>
+                <w:noProof/>
+                <w:webHidden/>
+              </w:rPr>
+            </w:r>
+            <w:r>
+              <w:rPr>
+                <w:noProof/>
+                <w:webHidden/>
+              </w:rPr>
+              <w:fldChar w:fldCharType="separate"/>
+            </w:r>
+            <w:r>
+              <w:rPr>
+                <w:noProof/>
+                <w:webHidden/>
+              </w:rPr>
+              <w:t>8</w:t>
+            </w:r>
+            <w:r>
+              <w:rPr>
+                <w:noProof/>
+                <w:webHidden/>
+              </w:rPr>
+              <w:fldChar w:fldCharType="end"/>
+            </w:r>
+          </w:hyperlink>
+        </w:p>
+        <w:p>
+          <w:pPr>
+            <w:pStyle w:val="TOC2"/>
+            <w:tabs>
+              <w:tab w:val="left" w:pos="960"/>
+              <w:tab w:val="right" w:leader="dot" w:pos="8630"/>
+            </w:tabs>
+            <w:rPr>
+              <w:rFonts w:eastAsiaTheme="minorEastAsia" w:cstheme="minorBidi"/>
+              <w:b w:val="0"/>
+              <w:bCs w:val="0"/>
+              <w:noProof/>
+              <w:kern w:val="2"/>
+              <w:sz w:val="24"/>
+              <w:szCs w:val="24"/>
+              <w14:ligatures w14:val="standardContextual"/>
+            </w:rPr>
+          </w:pPr>
+          <w:hyperlink w:anchor="_Toc229761540" w:history="1">
+            <w:r>
+              <w:rPr>
+                <w:rStyle w:val="Hyperlink"/>
+                <w:noProof/>
+              </w:rPr>
+              <w:t>6.3</w:t>
+            </w:r>
+            <w:r>
+              <w:rPr>
+                <w:rFonts w:eastAsiaTheme="minorEastAsia" w:cstheme="minorBidi"/>
+                <w:b w:val="0"/>
+                <w:bCs w:val="0"/>
+                <w:noProof/>
+                <w:kern w:val="2"/>
+                <w:sz w:val="24"/>
+                <w:szCs w:val="24"/>
+                <w14:ligatures w14:val="standardContextual"/>
+              </w:rPr>
+              <w:tab/>
+            </w:r>
+            <w:r>
+              <w:rPr>
+                <w:rStyle w:val="Hyperlink"/>
+                <w:noProof/>
+              </w:rPr>
+              <w:t>Validation</w:t>
+            </w:r>
+            <w:r>
+              <w:rPr>
+                <w:noProof/>
+                <w:webHidden/>
+              </w:rPr>
+              <w:tab/>
+            </w:r>
+            <w:r>
+              <w:rPr>
+                <w:noProof/>
+                <w:webHidden/>
+              </w:rPr>
+              <w:fldChar w:fldCharType="begin"/>
+            </w:r>
+            <w:r>
+              <w:rPr>
+                <w:noProof/>
+                <w:webHidden/>
+              </w:rPr>
+              <w:instrText xml:space="preserve"> PAGEREF _Toc229761540 \h </w:instrText>
+            </w:r>
+            <w:r>
+              <w:rPr>
+                <w:noProof/>
+                <w:webHidden/>
+              </w:rPr>
+            </w:r>
+            <w:r>
+              <w:rPr>
+                <w:noProof/>
+                <w:webHidden/>
+              </w:rPr>
+              <w:fldChar w:fldCharType="separate"/>
+            </w:r>
+            <w:r>
+              <w:rPr>
+                <w:noProof/>
+                <w:webHidden/>
+              </w:rPr>
+              <w:t>9</w:t>
+            </w:r>
+            <w:r>
+              <w:rPr>
+                <w:noProof/>
+                <w:webHidden/>
+              </w:rPr>
+              <w:fldChar w:fldCharType="end"/>
+            </w:r>
+          </w:hyperlink>
+        </w:p>
+        <w:p>
+          <w:pPr>
+            <w:pStyle w:val="TOC2"/>
+            <w:tabs>
+              <w:tab w:val="left" w:pos="960"/>
+              <w:tab w:val="right" w:leader="dot" w:pos="8630"/>
+            </w:tabs>
+            <w:rPr>
+              <w:rFonts w:eastAsiaTheme="minorEastAsia" w:cstheme="minorBidi"/>
+              <w:b w:val="0"/>
+              <w:bCs w:val="0"/>
+              <w:noProof/>
+              <w:kern w:val="2"/>
+              <w:sz w:val="24"/>
+              <w:szCs w:val="24"/>
+              <w14:ligatures w14:val="standardContextual"/>
+            </w:rPr>
+          </w:pPr>
+          <w:hyperlink w:anchor="_Toc229761541" w:history="1">
+            <w:r>
+              <w:rPr>
+                <w:rStyle w:val="Hyperlink"/>
+                <w:noProof/>
+              </w:rPr>
+              <w:t>6.4</w:t>
+            </w:r>
+            <w:r>
+              <w:rPr>
+                <w:rFonts w:eastAsiaTheme="minorEastAsia" w:cstheme="minorBidi"/>
+                <w:b w:val="0"/>
+                <w:bCs w:val="0"/>
+                <w:noProof/>
+                <w:kern w:val="2"/>
+                <w:sz w:val="24"/>
+                <w:szCs w:val="24"/>
+                <w14:ligatures w14:val="standardContextual"/>
+              </w:rPr>
+              <w:tab/>
+            </w:r>
+            <w:r>
+              <w:rPr>
+                <w:rStyle w:val="Hyperlink"/>
+                <w:noProof/>
+              </w:rPr>
+              <w:t>Export</w:t>
+            </w:r>
+            <w:r>
+              <w:rPr>
+                <w:noProof/>
+                <w:webHidden/>
+              </w:rPr>
+              <w:tab/>
+            </w:r>
+            <w:r>
+              <w:rPr>
+                <w:noProof/>
+                <w:webHidden/>
+              </w:rPr>
+              <w:fldChar w:fldCharType="begin"/>
+            </w:r>
+            <w:r>
+              <w:rPr>
+                <w:noProof/>
+                <w:webHidden/>
+              </w:rPr>
+              <w:instrText xml:space="preserve"> PAGEREF _Toc229761541 \h </w:instrText>
+            </w:r>
+            <w:r>
+              <w:rPr>
+                <w:noProof/>
+                <w:webHidden/>
+              </w:rPr>
+            </w:r>
+            <w:r>
+              <w:rPr>
+                <w:noProof/>
+                <w:webHidden/>
+              </w:rPr>
+              <w:fldChar w:fldCharType="separate"/>
+            </w:r>
+            <w:r>
+              <w:rPr>
+                <w:noProof/>
+                <w:webHidden/>
+              </w:rPr>
+              <w:t>10</w:t>
+            </w:r>
+            <w:r>
+              <w:rPr>
+                <w:noProof/>
+                <w:webHidden/>
+              </w:rPr>
+              <w:fldChar w:fldCharType="end"/>
+            </w:r>
+          </w:hyperlink>
+        </w:p>
+        <w:p>
+          <w:pPr>
+            <w:pStyle w:val="TOC2"/>
+            <w:tabs>
+              <w:tab w:val="left" w:pos="960"/>
+              <w:tab w:val="right" w:leader="dot" w:pos="8630"/>
+            </w:tabs>
+            <w:rPr>
+              <w:rFonts w:eastAsiaTheme="minorEastAsia" w:cstheme="minorBidi"/>
+              <w:b w:val="0"/>
+              <w:bCs w:val="0"/>
+              <w:noProof/>
+              <w:kern w:val="2"/>
+              <w:sz w:val="24"/>
+              <w:szCs w:val="24"/>
+              <w14:ligatures w14:val="standardContextual"/>
+            </w:rPr>
+          </w:pPr>
+          <w:hyperlink w:anchor="_Toc229761542" w:history="1">
+            <w:r>
+              <w:rPr>
+                <w:rStyle w:val="Hyperlink"/>
+                <w:noProof/>
+              </w:rPr>
+              <w:t>6.5</w:t>
+            </w:r>
+            <w:r>
+              <w:rPr>
+                <w:rFonts w:eastAsiaTheme="minorEastAsia" w:cstheme="minorBidi"/>
+                <w:b w:val="0"/>
+                <w:bCs w:val="0"/>
+                <w:noProof/>
+                <w:kern w:val="2"/>
+                <w:sz w:val="24"/>
+                <w:szCs w:val="24"/>
+                <w14:ligatures w14:val="standardContextual"/>
+              </w:rPr>
+              <w:tab/>
+            </w:r>
+            <w:r>
+              <w:rPr>
+                <w:rStyle w:val="Hyperlink"/>
+                <w:noProof/>
+              </w:rPr>
+              <w:t>History</w:t>
+            </w:r>
+            <w:r>
+              <w:rPr>
+                <w:noProof/>
+                <w:webHidden/>
+              </w:rPr>
+              <w:tab/>
+            </w:r>
+            <w:r>
+              <w:rPr>
+                <w:noProof/>
+                <w:webHidden/>
+              </w:rPr>
+              <w:fldChar w:fldCharType="begin"/>
+            </w:r>
+            <w:r>
+              <w:rPr>
+                <w:noProof/>
+                <w:webHidden/>
+              </w:rPr>
+              <w:instrText xml:space="preserve"> PAGEREF _Toc229761542 \h </w:instrText>
+            </w:r>
+            <w:r>
+              <w:rPr>
+                <w:noProof/>
+                <w:webHidden/>
+              </w:rPr>
+            </w:r>
+            <w:r>
+              <w:rPr>
+                <w:noProof/>
+                <w:webHidden/>
+              </w:rPr>
+              <w:fldChar w:fldCharType="separate"/>
+            </w:r>
+            <w:r>
+              <w:rPr>
+                <w:noProof/>
+                <w:webHidden/>
+              </w:rPr>
+              <w:t>10</w:t>
+            </w:r>
+            <w:r>
+              <w:rPr>
+                <w:noProof/>
+                <w:webHidden/>
+              </w:rPr>
+              <w:fldChar w:fldCharType="end"/>
+            </w:r>
+          </w:hyperlink>
+        </w:p>
+        <w:p>
+          <w:r>
+            <w:rPr>
+              <w:b/>
+              <w:bCs/>
+              <w:noProof/>
+            </w:rPr>
+            <w:fldChar w:fldCharType="end"/>
+          </w:r>
+        </w:p>
+      </w:sdtContent>
+    </w:sdt>
+    <w:p>
+      <w:pPr>
+        <w:rPr>
+          <w:rFonts w:cs="Arial"/>
+          <w:szCs w:val="24"/>
+        </w:rPr>
+      </w:pPr>
+    </w:p>
+    <w:p>
+      <w:pPr>
+        <w:rPr>
+          <w:rFonts w:cs="Arial"/>
+          <w:szCs w:val="24"/>
+        </w:rPr>
+      </w:pPr>
+    </w:p>
+    <w:p>
+      <w:pPr>
+        <w:rPr>
+          <w:rFonts w:cs="Arial"/>
+          <w:szCs w:val="24"/>
+        </w:rPr>
+      </w:pPr>
+    </w:p>
+    <w:p>
+      <w:pPr>
+        <w:rPr>
+          <w:rFonts w:cs="Arial"/>
+          <w:szCs w:val="24"/>
+        </w:rPr>
+      </w:pPr>
+    </w:p>
+    <w:p>
+      <w:pPr>
+        <w:spacing w:after="160" w:line="259" w:lineRule="auto"/>
+        <w:rPr>
+          <w:rFonts w:cs="Arial"/>
+          <w:szCs w:val="24"/>
+        </w:rPr>
+      </w:pPr>
+      <w:r>
+        <w:rPr>
+          <w:rFonts w:cs="Arial"/>
+          <w:szCs w:val="24"/>
+        </w:rPr>
+        <w:br w:type="page"/>
+      </w:r>
+    </w:p>
+    <w:p>
+      <w:pPr>
+        <w:pStyle w:val="Heading1"/>
+      </w:pPr>
+      <w:bookmarkStart w:id="0" w:name="_Toc229761532"/>
+      <w:r>
+        <w:lastRenderedPageBreak/>
+        <w:t>I</w:t>
+      </w:r>
+      <w:r>
+        <w:t>ntroduction</w:t>
+      </w:r>
+      <w:bookmarkEnd w:id="0"/>
+    </w:p>
+    <w:p>
+      <w:pPr>
+        <w:rPr>
+          <w:rFonts w:ascii="-webkit-standard" w:hAnsi="-webkit-standard"/>
+          <w:color w:val="000000"/>
+          <w:sz w:val="27"/>
+          <w:szCs w:val="27"/>
+        </w:rPr>
+      </w:pPr>
+    </w:p>
+    <w:p>
+      <w:pPr>
+        <w:rPr>
+          <w:rFonts w:ascii="-webkit-standard" w:hAnsi="-webkit-standard"/>
+          <w:color w:val="000000"/>
+          <w:szCs w:val="24"/>
+        </w:rPr>
+      </w:pPr>
+      <w:proofErr w:type="spellStart"/>
+      <w:r>
+        <w:rPr>
+          <w:rFonts w:ascii="-webkit-standard" w:hAnsi="-webkit-standard"/>
+          <w:color w:val="000000"/>
+          <w:szCs w:val="24"/>
+        </w:rPr>
+        <w:t>EduCode</w:t>
+      </w:r>
+      <w:proofErr w:type="spellEnd"/>
+      <w:r>
+        <w:rPr>
+          <w:rFonts w:ascii="-webkit-standard" w:hAnsi="-webkit-standard"/>
+          <w:color w:val="000000"/>
+          <w:szCs w:val="24"/>
+        </w:rPr>
+        <w:t xml:space="preserve"> is an AI-powered web application designed to assist teachers and programming instructors with automatic generation of programming exercises.</w:t>
+      </w:r>
+      <w:r>
+        <w:rPr>
+          <w:rFonts w:ascii="-webkit-standard" w:hAnsi="-webkit-standard"/>
+          <w:color w:val="000000"/>
+          <w:szCs w:val="24"/>
+        </w:rPr>
+        <w:t xml:space="preserve"> </w:t>
+      </w:r>
+      <w:r>
+        <w:rPr>
+          <w:rFonts w:ascii="-webkit-standard" w:hAnsi="-webkit-standard"/>
+          <w:color w:val="000000"/>
+          <w:szCs w:val="24"/>
+        </w:rPr>
+        <w:t>The system enables generation of tasks, solutions, and test cases based on selected programming language, concept, and difficulty level.</w:t>
+      </w:r>
+      <w:r>
+        <w:rPr>
+          <w:rFonts w:ascii="-webkit-standard" w:hAnsi="-webkit-standard"/>
+          <w:color w:val="000000"/>
+          <w:szCs w:val="24"/>
+        </w:rPr>
+        <w:t xml:space="preserve"> </w:t>
+      </w:r>
+      <w:r>
+        <w:rPr>
+          <w:rFonts w:ascii="-webkit-standard" w:hAnsi="-webkit-standard"/>
+          <w:color w:val="000000"/>
+          <w:szCs w:val="24"/>
+        </w:rPr>
+        <w:t>This document presents the initial system design, architecture, database structure, and interface mockups of the application.</w:t>
+      </w:r>
+    </w:p>
+    <w:p>
+      <w:pPr>
+        <w:rPr>
+          <w:rFonts w:ascii="-webkit-standard" w:hAnsi="-webkit-standard"/>
+          <w:color w:val="000000"/>
+          <w:sz w:val="27"/>
+          <w:szCs w:val="27"/>
+        </w:rPr>
+      </w:pPr>
+    </w:p>
+    <w:p>
+      <w:pPr>
+        <w:spacing w:after="160" w:line="259" w:lineRule="auto"/>
+        <w:rPr>
+          <w:rFonts w:ascii="-webkit-standard" w:hAnsi="-webkit-standard"/>
+          <w:color w:val="000000"/>
+          <w:sz w:val="27"/>
+          <w:szCs w:val="27"/>
+        </w:rPr>
+      </w:pPr>
+      <w:r>
+        <w:rPr>
+          <w:rFonts w:ascii="-webkit-standard" w:hAnsi="-webkit-standard"/>
+          <w:color w:val="000000"/>
+          <w:sz w:val="27"/>
+          <w:szCs w:val="27"/>
+        </w:rPr>
+        <w:br w:type="page"/>
+      </w:r>
+    </w:p>
+    <w:p>
+      <w:pPr>
+        <w:pStyle w:val="Heading1"/>
+      </w:pPr>
+      <w:bookmarkStart w:id="1" w:name="_Toc229761533"/>
+      <w:r>
+        <w:lastRenderedPageBreak/>
+        <w:t>Project Goals</w:t>
+      </w:r>
+      <w:bookmarkEnd w:id="1"/>
+    </w:p>
+    <w:p/>
     <w:p>
       <w:pPr>
         <w:pStyle w:val="ListParagraph"/>
         <w:numPr>
           <w:ilvl w:val="0"/>
-          <w:numId w:val="2"/>
+          <w:numId w:val="4"/>
         </w:numPr>
         <w:rPr>
-          <w:b/>
-        </w:rPr>
-      </w:pPr>
-      <w:r>
-        <w:rPr>
-          <w:b/>
-        </w:rPr>
+          <w:rFonts w:ascii="-webkit-standard" w:hAnsi="-webkit-standard"/>
+          <w:color w:val="000000"/>
+          <w:szCs w:val="24"/>
+        </w:rPr>
+      </w:pPr>
+      <w:r>
+        <w:rPr>
+          <w:rFonts w:ascii="-webkit-standard" w:hAnsi="-webkit-standard"/>
+          <w:color w:val="000000"/>
+          <w:szCs w:val="24"/>
+        </w:rPr>
+        <w:t>Simplify preparation of programming exercises</w:t>
+      </w:r>
+    </w:p>
+    <w:p>
+      <w:pPr>
+        <w:pStyle w:val="ListParagraph"/>
+        <w:numPr>
+          <w:ilvl w:val="0"/>
+          <w:numId w:val="4"/>
+        </w:numPr>
+        <w:rPr>
+          <w:rFonts w:ascii="-webkit-standard" w:hAnsi="-webkit-standard"/>
+          <w:color w:val="000000"/>
+          <w:szCs w:val="24"/>
+        </w:rPr>
+      </w:pPr>
+      <w:r>
+        <w:rPr>
+          <w:rFonts w:ascii="-webkit-standard" w:hAnsi="-webkit-standard"/>
+          <w:color w:val="000000"/>
+          <w:szCs w:val="24"/>
+        </w:rPr>
+        <w:t xml:space="preserve">Reduce time required for creating </w:t>
+      </w:r>
+      <w:proofErr w:type="spellStart"/>
+      <w:r>
+        <w:rPr>
+          <w:rFonts w:ascii="-webkit-standard" w:hAnsi="-webkit-standard"/>
+          <w:color w:val="000000"/>
+          <w:szCs w:val="24"/>
+        </w:rPr>
+        <w:t>assignments</w:t>
+      </w:r>
+      <w:proofErr w:type="spellEnd"/>
+    </w:p>
+    <w:p>
+      <w:pPr>
+        <w:pStyle w:val="ListParagraph"/>
+        <w:numPr>
+          <w:ilvl w:val="0"/>
+          <w:numId w:val="4"/>
+        </w:numPr>
+        <w:rPr>
+          <w:rFonts w:ascii="-webkit-standard" w:hAnsi="-webkit-standard"/>
+          <w:color w:val="000000"/>
+          <w:szCs w:val="24"/>
+        </w:rPr>
+      </w:pPr>
+      <w:r>
+        <w:rPr>
+          <w:rFonts w:ascii="-webkit-standard" w:hAnsi="-webkit-standard"/>
+          <w:color w:val="000000"/>
+          <w:szCs w:val="24"/>
+        </w:rPr>
+        <w:t>Support multiple programming languages</w:t>
+      </w:r>
+    </w:p>
+    <w:p>
+      <w:pPr>
+        <w:pStyle w:val="ListParagraph"/>
+        <w:numPr>
+          <w:ilvl w:val="0"/>
+          <w:numId w:val="4"/>
+        </w:numPr>
+        <w:rPr>
+          <w:rFonts w:ascii="-webkit-standard" w:hAnsi="-webkit-standard"/>
+          <w:color w:val="000000"/>
+          <w:szCs w:val="24"/>
+        </w:rPr>
+      </w:pPr>
+      <w:r>
+        <w:rPr>
+          <w:rFonts w:ascii="-webkit-standard" w:hAnsi="-webkit-standard"/>
+          <w:color w:val="000000"/>
+          <w:szCs w:val="24"/>
+        </w:rPr>
+        <w:t>Automatically generate test cases and solutions</w:t>
+      </w:r>
+    </w:p>
+    <w:p>
+      <w:pPr>
+        <w:pStyle w:val="ListParagraph"/>
+        <w:numPr>
+          <w:ilvl w:val="0"/>
+          <w:numId w:val="4"/>
+        </w:numPr>
+        <w:rPr>
+          <w:rFonts w:ascii="-webkit-standard" w:hAnsi="-webkit-standard"/>
+          <w:color w:val="000000"/>
+          <w:szCs w:val="24"/>
+        </w:rPr>
+      </w:pPr>
+      <w:r>
+        <w:rPr>
+          <w:rFonts w:ascii="-webkit-standard" w:hAnsi="-webkit-standard"/>
+          <w:color w:val="000000"/>
+          <w:szCs w:val="24"/>
+        </w:rPr>
+        <w:t>Enable export to educational platforms</w:t>
+      </w:r>
+    </w:p>
+    <w:p>
+      <w:pPr>
+        <w:pStyle w:val="ListParagraph"/>
+        <w:numPr>
+          <w:ilvl w:val="0"/>
+          <w:numId w:val="4"/>
+        </w:numPr>
+        <w:rPr>
+          <w:rFonts w:ascii="-webkit-standard" w:hAnsi="-webkit-standard"/>
+          <w:color w:val="000000"/>
+          <w:szCs w:val="24"/>
+        </w:rPr>
+      </w:pPr>
+      <w:r>
+        <w:rPr>
+          <w:rFonts w:ascii="-webkit-standard" w:hAnsi="-webkit-standard"/>
+          <w:color w:val="000000"/>
+          <w:szCs w:val="24"/>
+        </w:rPr>
+        <w:t>Provide AI-assisted validation of generated content</w:t>
+      </w:r>
+    </w:p>
+    <w:p>
+      <w:pPr>
+        <w:pStyle w:val="Heading1"/>
+      </w:pPr>
+      <w:bookmarkStart w:id="2" w:name="_Toc229761534"/>
+      <w:r>
         <w:t>Use Case Diagram (DPU)</w:t>
       </w:r>
-    </w:p>
-    <w:p>
-      <w:pPr>
-        <w:rPr>
-          <w:rFonts w:cs="Arial"/>
-          <w:szCs w:val="24"/>
-        </w:rPr>
-      </w:pPr>
-      <w:r>
-        <w:rPr>
-          <w:rFonts w:cs="Arial"/>
-          <w:szCs w:val="24"/>
-        </w:rPr>
-        <w:t xml:space="preserve">The Use Case Diagram illustrates the interactions between the professor/assistant user and the EduCode system. It shows the main functionalities such as task generation, template management, </w:t>
-      </w:r>
-      <w:proofErr w:type="gramStart"/>
-      <w:r>
-        <w:rPr>
-          <w:rFonts w:cs="Arial"/>
-          <w:szCs w:val="24"/>
-        </w:rPr>
-        <w:t>validation</w:t>
-      </w:r>
-      <w:proofErr w:type="gramEnd"/>
-      <w:r>
-        <w:rPr>
-          <w:rFonts w:cs="Arial"/>
-          <w:szCs w:val="24"/>
-        </w:rPr>
-        <w:t>, exporting, and reviewing task history.</w:t>
+      <w:bookmarkEnd w:id="2"/>
+    </w:p>
+    <w:p/>
+    <w:p>
+      <w:pPr>
+        <w:rPr>
+          <w:rFonts w:ascii="-webkit-standard" w:hAnsi="-webkit-standard"/>
+          <w:color w:val="000000"/>
+          <w:szCs w:val="24"/>
+        </w:rPr>
+      </w:pPr>
+      <w:r>
+        <w:rPr>
+          <w:rFonts w:ascii="-webkit-standard" w:hAnsi="-webkit-standard"/>
+          <w:color w:val="000000"/>
+          <w:szCs w:val="24"/>
+        </w:rPr>
+        <w:t xml:space="preserve">The Use Case Diagram illustrates the interactions between the professor/assistant user and the </w:t>
+      </w:r>
+      <w:proofErr w:type="spellStart"/>
+      <w:r>
+        <w:rPr>
+          <w:rFonts w:ascii="-webkit-standard" w:hAnsi="-webkit-standard"/>
+          <w:color w:val="000000"/>
+          <w:szCs w:val="24"/>
+        </w:rPr>
+        <w:t>EduCode</w:t>
+      </w:r>
+      <w:proofErr w:type="spellEnd"/>
+      <w:r>
+        <w:rPr>
+          <w:rFonts w:ascii="-webkit-standard" w:hAnsi="-webkit-standard"/>
+          <w:color w:val="000000"/>
+          <w:szCs w:val="24"/>
+        </w:rPr>
+        <w:t xml:space="preserve"> system. It shows the main functionalities such as task generation, template management, validation, exporting, and reviewing task history.</w:t>
       </w:r>
     </w:p>
     <w:p>
@@ -122,7 +1802,7 @@
                     <pic:cNvPicPr/>
                   </pic:nvPicPr>
                   <pic:blipFill>
-                    <a:blip r:embed="rId6"/>
+                    <a:blip r:embed="rId7"/>
                     <a:stretch>
                       <a:fillRect/>
                     </a:stretch>
@@ -145,55 +1825,94 @@
     </w:p>
     <w:p>
       <w:pPr>
-        <w:jc w:val="center"/>
-        <w:rPr>
-          <w:rFonts w:cs="Arial"/>
-          <w:szCs w:val="24"/>
-        </w:rPr>
-      </w:pPr>
-    </w:p>
-    <w:p>
-      <w:pPr>
-        <w:jc w:val="center"/>
-        <w:rPr>
-          <w:rFonts w:cs="Arial"/>
-          <w:szCs w:val="24"/>
-        </w:rPr>
-      </w:pPr>
-    </w:p>
-    <w:p>
-      <w:pPr>
-        <w:pStyle w:val="ListParagraph"/>
-        <w:numPr>
-          <w:ilvl w:val="0"/>
-          <w:numId w:val="2"/>
-        </w:numPr>
-        <w:rPr>
-          <w:b/>
-        </w:rPr>
-      </w:pPr>
-      <w:r>
-        <w:rPr>
-          <w:b/>
-        </w:rPr>
+        <w:pStyle w:val="Heading1"/>
+      </w:pPr>
+      <w:bookmarkStart w:id="3" w:name="_Toc229761535"/>
+      <w:r>
         <w:lastRenderedPageBreak/>
         <w:t>Entity Relationship Diagram (ERD)</w:t>
       </w:r>
-    </w:p>
-    <w:p>
-      <w:pPr>
-        <w:rPr>
-          <w:rFonts w:cs="Arial"/>
-          <w:szCs w:val="24"/>
-        </w:rPr>
-      </w:pPr>
-      <w:r>
-        <w:rPr>
-          <w:rFonts w:cs="Arial"/>
-          <w:szCs w:val="24"/>
-        </w:rPr>
-        <w:t>The ERD defines the database structure of the application. It includes entities such as User, Task, Template, TestCase, Solution, Language, and ValidationResult, along with their relationships and foreign keys.</w:t>
-      </w:r>
+      <w:bookmarkEnd w:id="3"/>
+    </w:p>
+    <w:p/>
+    <w:p>
+      <w:pPr>
+        <w:rPr>
+          <w:rFonts w:ascii="-webkit-standard" w:hAnsi="-webkit-standard"/>
+          <w:color w:val="000000"/>
+          <w:szCs w:val="24"/>
+        </w:rPr>
+      </w:pPr>
+      <w:r>
+        <w:rPr>
+          <w:rFonts w:ascii="-webkit-standard" w:hAnsi="-webkit-standard"/>
+          <w:color w:val="000000"/>
+          <w:szCs w:val="24"/>
+        </w:rPr>
+        <w:t xml:space="preserve">The ERD defines the database structure of the application. It includes entities such as User, Task, Template, </w:t>
+      </w:r>
+      <w:proofErr w:type="spellStart"/>
+      <w:r>
+        <w:rPr>
+          <w:rFonts w:ascii="-webkit-standard" w:hAnsi="-webkit-standard"/>
+          <w:color w:val="000000"/>
+          <w:szCs w:val="24"/>
+        </w:rPr>
+        <w:t>TestCase</w:t>
+      </w:r>
+      <w:proofErr w:type="spellEnd"/>
+      <w:r>
+        <w:rPr>
+          <w:rFonts w:ascii="-webkit-standard" w:hAnsi="-webkit-standard"/>
+          <w:color w:val="000000"/>
+          <w:szCs w:val="24"/>
+        </w:rPr>
+        <w:t xml:space="preserve">, Solution, Language, and </w:t>
+      </w:r>
+      <w:proofErr w:type="spellStart"/>
+      <w:r>
+        <w:rPr>
+          <w:rFonts w:ascii="-webkit-standard" w:hAnsi="-webkit-standard"/>
+          <w:color w:val="000000"/>
+          <w:szCs w:val="24"/>
+        </w:rPr>
+        <w:t>ValidationResult</w:t>
+      </w:r>
+      <w:proofErr w:type="spellEnd"/>
+      <w:r>
+        <w:rPr>
+          <w:rFonts w:ascii="-webkit-standard" w:hAnsi="-webkit-standard"/>
+          <w:color w:val="000000"/>
+          <w:szCs w:val="24"/>
+        </w:rPr>
+        <w:t>, along with their relationships and foreign keys.</w:t>
+      </w:r>
+    </w:p>
+    <w:p>
+      <w:pPr>
+        <w:rPr>
+          <w:rFonts w:ascii="-webkit-standard" w:hAnsi="-webkit-standard"/>
+          <w:color w:val="000000"/>
+          <w:szCs w:val="24"/>
+        </w:rPr>
+      </w:pPr>
+      <w:r>
+        <w:rPr>
+          <w:rFonts w:ascii="-webkit-standard" w:hAnsi="-webkit-standard"/>
+          <w:color w:val="000000"/>
+          <w:szCs w:val="24"/>
+        </w:rPr>
+        <w:t>The database is designed using relational principles and foreign key constraints to ensure data consistency and scalability.</w:t>
+      </w:r>
+    </w:p>
+    <w:p>
+      <w:pPr>
+        <w:rPr>
+          <w:rFonts w:ascii="-webkit-standard" w:hAnsi="-webkit-standard"/>
+          <w:color w:val="000000"/>
+          <w:szCs w:val="24"/>
+        </w:rPr>
+      </w:pPr>
     </w:p>
     <w:p>
       <w:pPr>
@@ -204,7 +1923,7 @@
           <w:noProof/>
         </w:rPr>
         <w:drawing>
-          <wp:inline distT="0" distB="0" distL="0" distR="0">
+          <wp:inline distT="0" distB="0" distL="0" distR="0" wp14:anchorId="5DF53F7F" wp14:editId="2491C5E0">
             <wp:extent cx="5043629" cy="3948295"/>
             <wp:effectExtent l="0" t="0" r="5080" b="0"/>
             <wp:docPr id="12" name="Picture 12" descr="C:\Users\Media\Desktop\3 god\2 semestar\Projekt\EduCode\documentation\ERD_EduCode.png"/>
@@ -221,7 +1940,7 @@
                     </pic:cNvPicPr>
                   </pic:nvPicPr>
                   <pic:blipFill>
-                    <a:blip r:embed="rId7" cstate="print">
+                    <a:blip r:embed="rId8" cstate="print">
                       <a:extLst>
                         <a:ext uri="{28A0092B-C50C-407E-A947-70E740481C1C}">
                           <a14:useLocalDpi xmlns:a14="http://schemas.microsoft.com/office/drawing/2010/main" val="0"/>
@@ -264,35 +1983,119 @@
     </w:p>
     <w:p>
       <w:pPr>
-        <w:pStyle w:val="ListParagraph"/>
-        <w:numPr>
-          <w:ilvl w:val="0"/>
-          <w:numId w:val="2"/>
-        </w:numPr>
-        <w:rPr>
-          <w:b/>
-        </w:rPr>
-      </w:pPr>
-      <w:r>
-        <w:rPr>
-          <w:b/>
-        </w:rPr>
+        <w:jc w:val="center"/>
+        <w:rPr>
+          <w:rFonts w:cs="Arial"/>
+          <w:szCs w:val="24"/>
+        </w:rPr>
+      </w:pPr>
+    </w:p>
+    <w:p>
+      <w:pPr>
+        <w:jc w:val="center"/>
+        <w:rPr>
+          <w:rFonts w:cs="Arial"/>
+          <w:szCs w:val="24"/>
+        </w:rPr>
+      </w:pPr>
+    </w:p>
+    <w:p>
+      <w:pPr>
+        <w:jc w:val="center"/>
+        <w:rPr>
+          <w:rFonts w:cs="Arial"/>
+          <w:szCs w:val="24"/>
+        </w:rPr>
+      </w:pPr>
+    </w:p>
+    <w:p>
+      <w:pPr>
+        <w:jc w:val="center"/>
+        <w:rPr>
+          <w:rFonts w:cs="Arial"/>
+          <w:szCs w:val="24"/>
+        </w:rPr>
+      </w:pPr>
+    </w:p>
+    <w:p>
+      <w:pPr>
+        <w:jc w:val="center"/>
+        <w:rPr>
+          <w:rFonts w:cs="Arial"/>
+          <w:szCs w:val="24"/>
+        </w:rPr>
+      </w:pPr>
+    </w:p>
+    <w:p>
+      <w:pPr>
+        <w:pStyle w:val="Heading1"/>
+      </w:pPr>
+      <w:bookmarkStart w:id="4" w:name="_Toc229761536"/>
+      <w:r>
+        <w:lastRenderedPageBreak/>
         <w:t>Architecture Design</w:t>
       </w:r>
-    </w:p>
-    <w:p>
-      <w:pPr>
-        <w:rPr>
-          <w:rFonts w:cs="Arial"/>
-          <w:szCs w:val="24"/>
-        </w:rPr>
-      </w:pPr>
-      <w:r>
-        <w:rPr>
-          <w:rFonts w:cs="Arial"/>
-          <w:szCs w:val="24"/>
-        </w:rPr>
-        <w:t>The architecture diagram presents the communication flow between the frontend, backend, database, OpenAI API, Docker sandbox, PDF generator, and Moodle XML generator. The system uses FastAPI for backend services and React for the frontend interface.</w:t>
+      <w:bookmarkEnd w:id="4"/>
+    </w:p>
+    <w:p>
+      <w:pPr>
+        <w:rPr>
+          <w:rFonts w:ascii="-webkit-standard" w:hAnsi="-webkit-standard"/>
+          <w:color w:val="000000"/>
+          <w:szCs w:val="24"/>
+        </w:rPr>
+      </w:pPr>
+    </w:p>
+    <w:p>
+      <w:pPr>
+        <w:rPr>
+          <w:rFonts w:ascii="-webkit-standard" w:hAnsi="-webkit-standard"/>
+          <w:color w:val="000000"/>
+          <w:szCs w:val="24"/>
+        </w:rPr>
+      </w:pPr>
+      <w:r>
+        <w:rPr>
+          <w:rFonts w:ascii="-webkit-standard" w:hAnsi="-webkit-standard"/>
+          <w:color w:val="000000"/>
+          <w:szCs w:val="24"/>
+        </w:rPr>
+        <w:t xml:space="preserve">The architecture diagram presents the communication flow between the frontend, backend, database, OpenAI API, Docker sandbox, PDF generator, and Moodle XML generator. The system uses </w:t>
+      </w:r>
+      <w:proofErr w:type="spellStart"/>
+      <w:r>
+        <w:rPr>
+          <w:rFonts w:ascii="-webkit-standard" w:hAnsi="-webkit-standard"/>
+          <w:color w:val="000000"/>
+          <w:szCs w:val="24"/>
+        </w:rPr>
+        <w:t>FastAPI</w:t>
+      </w:r>
+      <w:proofErr w:type="spellEnd"/>
+      <w:r>
+        <w:rPr>
+          <w:rFonts w:ascii="-webkit-standard" w:hAnsi="-webkit-standard"/>
+          <w:color w:val="000000"/>
+          <w:szCs w:val="24"/>
+        </w:rPr>
+        <w:t xml:space="preserve"> for backend services and React for the frontend interface.</w:t>
+      </w:r>
+    </w:p>
+    <w:p>
+      <w:pPr>
+        <w:rPr>
+          <w:rFonts w:ascii="-webkit-standard" w:hAnsi="-webkit-standard"/>
+          <w:color w:val="000000"/>
+          <w:szCs w:val="24"/>
+        </w:rPr>
+      </w:pPr>
+      <w:r>
+        <w:rPr>
+          <w:rFonts w:ascii="-webkit-standard" w:hAnsi="-webkit-standard"/>
+          <w:color w:val="000000"/>
+          <w:szCs w:val="24"/>
+        </w:rPr>
+        <w:t>Docker containers are used for simplified deployment and environment consistency.</w:t>
       </w:r>
     </w:p>
     <w:p>
@@ -309,7 +2112,6 @@
           <w:noProof/>
           <w:szCs w:val="24"/>
         </w:rPr>
-        <w:lastRenderedPageBreak/>
         <w:drawing>
           <wp:inline distT="0" distB="0" distL="0" distR="0" wp14:anchorId="0D2B4423" wp14:editId="4FE19A34">
             <wp:extent cx="5943600" cy="3639278"/>
@@ -326,7 +2128,7 @@
                     <pic:cNvPicPr/>
                   </pic:nvPicPr>
                   <pic:blipFill>
-                    <a:blip r:embed="rId8"/>
+                    <a:blip r:embed="rId9"/>
                     <a:stretch>
                       <a:fillRect/>
                     </a:stretch>
@@ -367,188 +2169,137 @@
     </w:p>
     <w:p>
       <w:pPr>
-        <w:jc w:val="center"/>
-        <w:rPr>
-          <w:rFonts w:cs="Arial"/>
-          <w:szCs w:val="24"/>
-        </w:rPr>
-      </w:pPr>
-    </w:p>
-    <w:p>
-      <w:pPr>
-        <w:jc w:val="center"/>
-        <w:rPr>
-          <w:rFonts w:cs="Arial"/>
-          <w:szCs w:val="24"/>
-        </w:rPr>
-      </w:pPr>
-    </w:p>
-    <w:p>
-      <w:pPr>
-        <w:jc w:val="center"/>
-        <w:rPr>
-          <w:rFonts w:cs="Arial"/>
-          <w:szCs w:val="24"/>
-        </w:rPr>
-      </w:pPr>
-    </w:p>
-    <w:p>
-      <w:pPr>
-        <w:jc w:val="center"/>
-        <w:rPr>
-          <w:rFonts w:cs="Arial"/>
-          <w:szCs w:val="24"/>
-        </w:rPr>
-      </w:pPr>
-    </w:p>
-    <w:p>
-      <w:pPr>
-        <w:jc w:val="center"/>
-        <w:rPr>
-          <w:rFonts w:cs="Arial"/>
-          <w:szCs w:val="24"/>
-        </w:rPr>
-      </w:pPr>
-    </w:p>
-    <w:p>
-      <w:pPr>
-        <w:jc w:val="center"/>
-        <w:rPr>
-          <w:rFonts w:cs="Arial"/>
-          <w:szCs w:val="24"/>
-        </w:rPr>
-      </w:pPr>
-    </w:p>
-    <w:p>
-      <w:pPr>
-        <w:jc w:val="center"/>
-        <w:rPr>
-          <w:rFonts w:cs="Arial"/>
-          <w:szCs w:val="24"/>
-        </w:rPr>
-      </w:pPr>
-    </w:p>
-    <w:p>
-      <w:pPr>
-        <w:jc w:val="center"/>
-        <w:rPr>
-          <w:rFonts w:cs="Arial"/>
-          <w:szCs w:val="24"/>
-        </w:rPr>
-      </w:pPr>
-    </w:p>
-    <w:p>
-      <w:pPr>
-        <w:jc w:val="center"/>
-        <w:rPr>
-          <w:rFonts w:cs="Arial"/>
-          <w:szCs w:val="24"/>
-        </w:rPr>
-      </w:pPr>
-    </w:p>
-    <w:p>
-      <w:pPr>
-        <w:jc w:val="center"/>
-        <w:rPr>
-          <w:rFonts w:cs="Arial"/>
-          <w:szCs w:val="24"/>
-        </w:rPr>
-      </w:pPr>
-    </w:p>
-    <w:p>
-      <w:pPr>
-        <w:jc w:val="center"/>
-        <w:rPr>
-          <w:rFonts w:cs="Arial"/>
-          <w:szCs w:val="24"/>
-        </w:rPr>
-      </w:pPr>
-    </w:p>
-    <w:p>
-      <w:pPr>
-        <w:pStyle w:val="ListParagraph"/>
-        <w:numPr>
-          <w:ilvl w:val="0"/>
-          <w:numId w:val="2"/>
-        </w:numPr>
-        <w:rPr>
-          <w:b/>
-        </w:rPr>
-      </w:pPr>
-      <w:r>
-        <w:rPr>
-          <w:b/>
-        </w:rPr>
+        <w:spacing w:after="160" w:line="259" w:lineRule="auto"/>
+        <w:rPr>
+          <w:rFonts w:cs="Arial"/>
+          <w:szCs w:val="24"/>
+        </w:rPr>
+      </w:pPr>
+      <w:r>
+        <w:rPr>
+          <w:rFonts w:cs="Arial"/>
+          <w:szCs w:val="24"/>
+        </w:rPr>
+        <w:br w:type="page"/>
+      </w:r>
+    </w:p>
+    <w:p>
+      <w:pPr>
+        <w:pStyle w:val="Heading1"/>
+      </w:pPr>
+      <w:bookmarkStart w:id="5" w:name="_Toc229761537"/>
+      <w:r>
         <w:lastRenderedPageBreak/>
         <w:t>System Mockups</w:t>
       </w:r>
-    </w:p>
-    <w:p>
-      <w:pPr>
-        <w:rPr>
-          <w:rFonts w:cs="Arial"/>
-          <w:szCs w:val="24"/>
-        </w:rPr>
-      </w:pPr>
-      <w:r>
-        <w:rPr>
-          <w:rFonts w:cs="Arial"/>
-          <w:szCs w:val="24"/>
-        </w:rPr>
-        <w:t>The following mockups present the user interface design of the EduCode AI Task Generator application. They demonstrate the main pages and workflows available to users.</w:t>
-      </w:r>
-    </w:p>
-    <w:p>
-      <w:pPr>
-        <w:rPr>
-          <w:rFonts w:cs="Arial"/>
-          <w:szCs w:val="24"/>
-        </w:rPr>
-      </w:pPr>
-    </w:p>
-    <w:p>
-      <w:pPr>
-        <w:pStyle w:val="ListParagraph"/>
-        <w:numPr>
-          <w:ilvl w:val="1"/>
-          <w:numId w:val="2"/>
-        </w:numPr>
-        <w:rPr>
-          <w:b/>
-        </w:rPr>
-      </w:pPr>
-      <w:r>
-        <w:rPr>
-          <w:b/>
-        </w:rPr>
-        <w:t>Mockup</w:t>
-      </w:r>
-    </w:p>
-    <w:p>
-      <w:pPr>
-        <w:rPr>
-          <w:rFonts w:cs="Arial"/>
-          <w:szCs w:val="24"/>
-        </w:rPr>
-      </w:pPr>
-      <w:r>
-        <w:rPr>
-          <w:rFonts w:cs="Arial"/>
-          <w:szCs w:val="24"/>
-        </w:rPr>
-        <w:t>Generate Task page where users select programming language, concept, difficulty level, and templat</w:t>
-      </w:r>
-      <w:r>
-        <w:rPr>
-          <w:rFonts w:cs="Arial"/>
-          <w:szCs w:val="24"/>
-        </w:rPr>
-        <w:t>es.</w:t>
-      </w:r>
-      <w:r>
-        <w:rPr>
-          <w:rFonts w:cs="Arial"/>
-          <w:noProof/>
+      <w:bookmarkEnd w:id="5"/>
+    </w:p>
+    <w:p>
+      <w:pPr>
+        <w:rPr>
+          <w:rFonts w:ascii="-webkit-standard" w:hAnsi="-webkit-standard"/>
+          <w:color w:val="000000"/>
+          <w:szCs w:val="24"/>
+        </w:rPr>
+      </w:pPr>
+      <w:r>
+        <w:rPr>
+          <w:rFonts w:ascii="-webkit-standard" w:hAnsi="-webkit-standard"/>
+          <w:color w:val="000000"/>
+          <w:szCs w:val="24"/>
+        </w:rPr>
+        <w:t>The mockups were designed to visualize the expected user workflow and interface organization before full implementation.</w:t>
+      </w:r>
+    </w:p>
+    <w:p>
+      <w:pPr>
+        <w:rPr>
+          <w:rFonts w:ascii="-webkit-standard" w:hAnsi="-webkit-standard"/>
+          <w:color w:val="000000"/>
+          <w:szCs w:val="24"/>
+        </w:rPr>
+      </w:pPr>
+      <w:r>
+        <w:rPr>
+          <w:rFonts w:ascii="-webkit-standard" w:hAnsi="-webkit-standard"/>
+          <w:color w:val="000000"/>
+          <w:szCs w:val="24"/>
+        </w:rPr>
+        <w:t xml:space="preserve">The following mockups present the user interface design of the </w:t>
+      </w:r>
+      <w:proofErr w:type="spellStart"/>
+      <w:r>
+        <w:rPr>
+          <w:rFonts w:ascii="-webkit-standard" w:hAnsi="-webkit-standard"/>
+          <w:color w:val="000000"/>
+          <w:szCs w:val="24"/>
+        </w:rPr>
+        <w:t>EduCode</w:t>
+      </w:r>
+      <w:proofErr w:type="spellEnd"/>
+      <w:r>
+        <w:rPr>
+          <w:rFonts w:ascii="-webkit-standard" w:hAnsi="-webkit-standard"/>
+          <w:color w:val="000000"/>
+          <w:szCs w:val="24"/>
+        </w:rPr>
+        <w:t xml:space="preserve"> AI Task Generator application. They demonstrate the main pages and workflows available to users.</w:t>
+      </w:r>
+    </w:p>
+    <w:p>
+      <w:pPr>
+        <w:rPr>
+          <w:rFonts w:ascii="-webkit-standard" w:hAnsi="-webkit-standard"/>
+          <w:color w:val="000000"/>
+          <w:szCs w:val="24"/>
+        </w:rPr>
+      </w:pPr>
+    </w:p>
+    <w:p>
+      <w:pPr>
+        <w:pStyle w:val="Heading2"/>
+      </w:pPr>
+      <w:bookmarkStart w:id="6" w:name="_Toc229761538"/>
+      <w:r>
+        <w:t>Generate t</w:t>
+      </w:r>
+      <w:r>
+        <w:t>a</w:t>
+      </w:r>
+      <w:r>
+        <w:t>sk</w:t>
+      </w:r>
+      <w:bookmarkEnd w:id="6"/>
+    </w:p>
+    <w:p>
+      <w:pPr>
+        <w:rPr>
+          <w:rFonts w:ascii="-webkit-standard" w:hAnsi="-webkit-standard"/>
+          <w:color w:val="000000"/>
+          <w:szCs w:val="24"/>
+        </w:rPr>
+      </w:pPr>
+      <w:r>
+        <w:rPr>
+          <w:rFonts w:ascii="-webkit-standard" w:hAnsi="-webkit-standard"/>
+          <w:color w:val="000000"/>
+          <w:szCs w:val="24"/>
+        </w:rPr>
+        <w:t>Generate Task page where users select programming language, concept, difficulty level, and templates.</w:t>
+      </w:r>
+    </w:p>
+    <w:p>
+      <w:pPr>
+        <w:rPr>
+          <w:rFonts w:ascii="-webkit-standard" w:hAnsi="-webkit-standard"/>
+          <w:color w:val="000000"/>
+          <w:szCs w:val="24"/>
+        </w:rPr>
+      </w:pPr>
+      <w:r>
+        <w:rPr>
+          <w:rFonts w:ascii="-webkit-standard" w:hAnsi="-webkit-standard"/>
+          <w:color w:val="000000"/>
           <w:szCs w:val="24"/>
         </w:rPr>
         <w:drawing>
@@ -567,7 +2318,7 @@
                     <pic:cNvPicPr/>
                   </pic:nvPicPr>
                   <pic:blipFill>
-                    <a:blip r:embed="rId9"/>
+                    <a:blip r:embed="rId10"/>
                     <a:stretch>
                       <a:fillRect/>
                     </a:stretch>
@@ -590,32 +2341,16 @@
     </w:p>
     <w:p>
       <w:pPr>
-        <w:pStyle w:val="ListParagraph"/>
-        <w:numPr>
-          <w:ilvl w:val="1"/>
-          <w:numId w:val="2"/>
-        </w:numPr>
-        <w:rPr>
-          <w:b/>
-        </w:rPr>
-      </w:pPr>
-      <w:r>
-        <w:rPr>
-          <w:b/>
-        </w:rPr>
-        <w:t>Mockup</w:t>
-      </w:r>
-    </w:p>
-    <w:p>
-      <w:pPr>
-        <w:rPr>
-          <w:rFonts w:cs="Arial"/>
-          <w:szCs w:val="24"/>
-        </w:rPr>
-      </w:pPr>
-      <w:r>
-        <w:rPr>
-          <w:rFonts w:cs="Arial"/>
+        <w:rPr>
+          <w:rFonts w:ascii="-webkit-standard" w:hAnsi="-webkit-standard"/>
+          <w:color w:val="000000"/>
+          <w:szCs w:val="24"/>
+        </w:rPr>
+      </w:pPr>
+      <w:r>
+        <w:rPr>
+          <w:rFonts w:ascii="-webkit-standard" w:hAnsi="-webkit-standard"/>
+          <w:color w:val="000000"/>
           <w:szCs w:val="24"/>
         </w:rPr>
         <w:t>Generated result view displaying task descriptions, reference solutions, and unit tests.</w:t>
@@ -636,9 +2371,9 @@
           <w:szCs w:val="24"/>
         </w:rPr>
         <w:drawing>
-          <wp:inline distT="0" distB="0" distL="0" distR="0" wp14:anchorId="661CA21D" wp14:editId="738418A9">
-            <wp:extent cx="5943600" cy="2536864"/>
-            <wp:effectExtent l="0" t="0" r="0" b="0"/>
+          <wp:inline distT="0" distB="0" distL="0" distR="0" wp14:anchorId="661CA21D" wp14:editId="22AFB471">
+            <wp:extent cx="5553512" cy="2370365"/>
+            <wp:effectExtent l="0" t="0" r="0" b="5080"/>
             <wp:docPr id="5" name="Picture 5"/>
             <wp:cNvGraphicFramePr>
               <a:graphicFrameLocks xmlns:a="http://schemas.openxmlformats.org/drawingml/2006/main" noChangeAspect="1"/>
@@ -651,7 +2386,7 @@
                     <pic:cNvPicPr/>
                   </pic:nvPicPr>
                   <pic:blipFill>
-                    <a:blip r:embed="rId10"/>
+                    <a:blip r:embed="rId11"/>
                     <a:stretch>
                       <a:fillRect/>
                     </a:stretch>
@@ -659,7 +2394,7 @@
                   <pic:spPr>
                     <a:xfrm>
                       <a:off x="0" y="0"/>
-                      <a:ext cx="5943600" cy="2536864"/>
+                      <a:ext cx="5573354" cy="2378834"/>
                     </a:xfrm>
                     <a:prstGeom prst="rect">
                       <a:avLst/>
@@ -674,37 +2409,40 @@
     </w:p>
     <w:p>
       <w:pPr>
-        <w:pStyle w:val="ListParagraph"/>
-        <w:numPr>
-          <w:ilvl w:val="1"/>
-          <w:numId w:val="2"/>
-        </w:numPr>
-        <w:rPr>
-          <w:b/>
-        </w:rPr>
-      </w:pPr>
-      <w:r>
-        <w:rPr>
-          <w:b/>
-        </w:rPr>
+        <w:pStyle w:val="Heading2"/>
+      </w:pPr>
+      <w:bookmarkStart w:id="7" w:name="_Toc229761539"/>
+      <w:r>
         <w:lastRenderedPageBreak/>
-        <w:t>Mockup</w:t>
-      </w:r>
-    </w:p>
-    <w:p>
-      <w:pPr>
-        <w:rPr>
-          <w:rFonts w:cs="Arial"/>
-          <w:szCs w:val="24"/>
-        </w:rPr>
-      </w:pPr>
-      <w:r>
-        <w:rPr>
-          <w:rFonts w:cs="Arial"/>
+        <w:t>Templates</w:t>
+      </w:r>
+      <w:bookmarkEnd w:id="7"/>
+    </w:p>
+    <w:p>
+      <w:pPr>
+        <w:rPr>
+          <w:rFonts w:ascii="-webkit-standard" w:hAnsi="-webkit-standard"/>
+          <w:color w:val="000000"/>
+          <w:szCs w:val="24"/>
+        </w:rPr>
+      </w:pPr>
+      <w:r>
+        <w:rPr>
+          <w:rFonts w:ascii="-webkit-standard" w:hAnsi="-webkit-standard"/>
+          <w:color w:val="000000"/>
           <w:szCs w:val="24"/>
         </w:rPr>
         <w:t>Template editor interface used to create and customize reusable task templates.</w:t>
       </w:r>
+    </w:p>
+    <w:p>
+      <w:pPr>
+        <w:rPr>
+          <w:rFonts w:ascii="-webkit-standard" w:hAnsi="-webkit-standard"/>
+          <w:color w:val="000000"/>
+          <w:szCs w:val="24"/>
+        </w:rPr>
+      </w:pPr>
     </w:p>
     <w:p>
       <w:pPr>
@@ -736,7 +2474,7 @@
                     <pic:cNvPicPr/>
                   </pic:nvPicPr>
                   <pic:blipFill>
-                    <a:blip r:embed="rId11"/>
+                    <a:blip r:embed="rId12"/>
                     <a:stretch>
                       <a:fillRect/>
                     </a:stretch>
@@ -759,36 +2497,38 @@
     </w:p>
     <w:p>
       <w:pPr>
-        <w:pStyle w:val="ListParagraph"/>
-        <w:numPr>
-          <w:ilvl w:val="1"/>
-          <w:numId w:val="2"/>
-        </w:numPr>
-        <w:rPr>
-          <w:b/>
-        </w:rPr>
-      </w:pPr>
-      <w:r>
-        <w:rPr>
-          <w:b/>
-        </w:rPr>
-        <w:t>Mockup</w:t>
-      </w:r>
-    </w:p>
-    <w:p>
-      <w:pPr>
-        <w:rPr>
-          <w:rFonts w:cs="Arial"/>
-          <w:szCs w:val="24"/>
-        </w:rPr>
-      </w:pPr>
-      <w:r>
-        <w:rPr>
-          <w:rFonts w:cs="Arial"/>
+        <w:jc w:val="center"/>
+        <w:rPr>
+          <w:rFonts w:cs="Arial"/>
+          <w:szCs w:val="24"/>
+        </w:rPr>
+      </w:pPr>
+    </w:p>
+    <w:p>
+      <w:pPr>
+        <w:rPr>
+          <w:rFonts w:ascii="-webkit-standard" w:hAnsi="-webkit-standard"/>
+          <w:color w:val="000000"/>
+          <w:szCs w:val="24"/>
+        </w:rPr>
+      </w:pPr>
+      <w:r>
+        <w:rPr>
+          <w:rFonts w:ascii="-webkit-standard" w:hAnsi="-webkit-standard"/>
+          <w:color w:val="000000"/>
           <w:szCs w:val="24"/>
         </w:rPr>
         <w:t>Template editor with restrictions and predefined code structure templates.</w:t>
       </w:r>
+    </w:p>
+    <w:p>
+      <w:pPr>
+        <w:rPr>
+          <w:rFonts w:ascii="-webkit-standard" w:hAnsi="-webkit-standard"/>
+          <w:color w:val="000000"/>
+          <w:szCs w:val="24"/>
+        </w:rPr>
+      </w:pPr>
     </w:p>
     <w:p>
       <w:pPr>
@@ -820,7 +2560,7 @@
                     <pic:cNvPicPr/>
                   </pic:nvPicPr>
                   <pic:blipFill>
-                    <a:blip r:embed="rId12"/>
+                    <a:blip r:embed="rId13"/>
                     <a:stretch>
                       <a:fillRect/>
                     </a:stretch>
@@ -861,62 +2601,19 @@
     </w:p>
     <w:p>
       <w:pPr>
-        <w:jc w:val="center"/>
-        <w:rPr>
-          <w:rFonts w:cs="Arial"/>
-          <w:szCs w:val="24"/>
-        </w:rPr>
-      </w:pPr>
-    </w:p>
-    <w:p>
-      <w:pPr>
-        <w:jc w:val="center"/>
-        <w:rPr>
-          <w:rFonts w:cs="Arial"/>
-          <w:szCs w:val="24"/>
-        </w:rPr>
-      </w:pPr>
-    </w:p>
-    <w:p>
-      <w:pPr>
-        <w:jc w:val="center"/>
-        <w:rPr>
-          <w:rFonts w:cs="Arial"/>
-          <w:szCs w:val="24"/>
-        </w:rPr>
-      </w:pPr>
-    </w:p>
-    <w:p>
-      <w:pPr>
-        <w:pStyle w:val="ListParagraph"/>
-        <w:numPr>
-          <w:ilvl w:val="1"/>
-          <w:numId w:val="2"/>
-        </w:numPr>
-        <w:rPr>
-          <w:b/>
-        </w:rPr>
-      </w:pPr>
-      <w:r>
-        <w:rPr>
-          <w:b/>
+        <w:rPr>
+          <w:rFonts w:ascii="-webkit-standard" w:hAnsi="-webkit-standard"/>
+          <w:color w:val="000000"/>
+          <w:szCs w:val="24"/>
+        </w:rPr>
+      </w:pPr>
+      <w:r>
+        <w:rPr>
+          <w:rFonts w:ascii="-webkit-standard" w:hAnsi="-webkit-standard"/>
+          <w:color w:val="000000"/>
+          <w:szCs w:val="24"/>
         </w:rPr>
         <w:lastRenderedPageBreak/>
-        <w:t>Mockup</w:t>
-      </w:r>
-    </w:p>
-    <w:p>
-      <w:pPr>
-        <w:rPr>
-          <w:rFonts w:cs="Arial"/>
-          <w:szCs w:val="24"/>
-        </w:rPr>
-      </w:pPr>
-      <w:r>
-        <w:rPr>
-          <w:rFonts w:cs="Arial"/>
-          <w:szCs w:val="24"/>
-        </w:rPr>
         <w:t>Existing templates overview showing available templates and generated task statistics.</w:t>
       </w:r>
     </w:p>
@@ -950,7 +2647,7 @@
                     <pic:cNvPicPr/>
                   </pic:nvPicPr>
                   <pic:blipFill>
-                    <a:blip r:embed="rId13"/>
+                    <a:blip r:embed="rId14"/>
                     <a:stretch>
                       <a:fillRect/>
                     </a:stretch>
@@ -973,36 +2670,48 @@
     </w:p>
     <w:p>
       <w:pPr>
-        <w:pStyle w:val="ListParagraph"/>
-        <w:numPr>
-          <w:ilvl w:val="1"/>
-          <w:numId w:val="2"/>
-        </w:numPr>
-        <w:rPr>
-          <w:b/>
-        </w:rPr>
-      </w:pPr>
-      <w:r>
-        <w:rPr>
-          <w:b/>
-        </w:rPr>
-        <w:t>Mockup</w:t>
-      </w:r>
-    </w:p>
-    <w:p>
-      <w:pPr>
-        <w:rPr>
-          <w:rFonts w:cs="Arial"/>
-          <w:szCs w:val="24"/>
-        </w:rPr>
-      </w:pPr>
-      <w:r>
-        <w:rPr>
-          <w:rFonts w:cs="Arial"/>
+        <w:jc w:val="center"/>
+        <w:rPr>
+          <w:rFonts w:cs="Arial"/>
+          <w:szCs w:val="24"/>
+        </w:rPr>
+      </w:pPr>
+    </w:p>
+    <w:p>
+      <w:pPr>
+        <w:pStyle w:val="Heading2"/>
+      </w:pPr>
+      <w:bookmarkStart w:id="8" w:name="_Toc229761540"/>
+      <w:r>
+        <w:t>Validation</w:t>
+      </w:r>
+      <w:bookmarkEnd w:id="8"/>
+    </w:p>
+    <w:p>
+      <w:pPr>
+        <w:rPr>
+          <w:rFonts w:ascii="-webkit-standard" w:hAnsi="-webkit-standard"/>
+          <w:color w:val="000000"/>
+          <w:szCs w:val="24"/>
+        </w:rPr>
+      </w:pPr>
+      <w:r>
+        <w:rPr>
+          <w:rFonts w:ascii="-webkit-standard" w:hAnsi="-webkit-standard"/>
+          <w:color w:val="000000"/>
           <w:szCs w:val="24"/>
         </w:rPr>
         <w:t>Validation dashboard displaying validation results, execution times, and task statuses.</w:t>
       </w:r>
+    </w:p>
+    <w:p>
+      <w:pPr>
+        <w:rPr>
+          <w:rFonts w:ascii="-webkit-standard" w:hAnsi="-webkit-standard"/>
+          <w:color w:val="000000"/>
+          <w:szCs w:val="24"/>
+        </w:rPr>
+      </w:pPr>
     </w:p>
     <w:p>
       <w:pPr>
@@ -1034,7 +2743,7 @@
                     <pic:cNvPicPr/>
                   </pic:nvPicPr>
                   <pic:blipFill>
-                    <a:blip r:embed="rId14"/>
+                    <a:blip r:embed="rId15"/>
                     <a:stretch>
                       <a:fillRect/>
                     </a:stretch>
@@ -1081,42 +2790,43 @@
           <w:szCs w:val="24"/>
         </w:rPr>
       </w:pPr>
-      <w:bookmarkStart w:id="0" w:name="_GoBack"/>
-      <w:bookmarkEnd w:id="0"/>
-    </w:p>
-    <w:p>
-      <w:pPr>
-        <w:pStyle w:val="ListParagraph"/>
-        <w:numPr>
-          <w:ilvl w:val="1"/>
-          <w:numId w:val="2"/>
-        </w:numPr>
-        <w:rPr>
-          <w:b/>
-        </w:rPr>
-      </w:pPr>
-      <w:r>
-        <w:rPr>
-          <w:b/>
-        </w:rPr>
+    </w:p>
+    <w:p>
+      <w:pPr>
+        <w:pStyle w:val="Heading2"/>
+      </w:pPr>
+      <w:bookmarkStart w:id="9" w:name="_Toc229761541"/>
+      <w:r>
         <w:lastRenderedPageBreak/>
-        <w:t xml:space="preserve"> Mockup</w:t>
-      </w:r>
-    </w:p>
-    <w:p>
-      <w:pPr>
-        <w:rPr>
-          <w:rFonts w:cs="Arial"/>
-          <w:szCs w:val="24"/>
-        </w:rPr>
-      </w:pPr>
-      <w:r>
-        <w:rPr>
-          <w:rFonts w:cs="Arial"/>
+        <w:t>Export</w:t>
+      </w:r>
+      <w:bookmarkEnd w:id="9"/>
+    </w:p>
+    <w:p>
+      <w:pPr>
+        <w:rPr>
+          <w:rFonts w:ascii="-webkit-standard" w:hAnsi="-webkit-standard"/>
+          <w:color w:val="000000"/>
+          <w:szCs w:val="24"/>
+        </w:rPr>
+      </w:pPr>
+      <w:r>
+        <w:rPr>
+          <w:rFonts w:ascii="-webkit-standard" w:hAnsi="-webkit-standard"/>
+          <w:color w:val="000000"/>
           <w:szCs w:val="24"/>
         </w:rPr>
         <w:t>Export section prepared for exporting generated tasks into PDF or Moodle XML formats.</w:t>
       </w:r>
+    </w:p>
+    <w:p>
+      <w:pPr>
+        <w:rPr>
+          <w:rFonts w:ascii="-webkit-standard" w:hAnsi="-webkit-standard"/>
+          <w:color w:val="000000"/>
+          <w:szCs w:val="24"/>
+        </w:rPr>
+      </w:pPr>
     </w:p>
     <w:p>
       <w:pPr>
@@ -1148,7 +2858,7 @@
                     <pic:cNvPicPr/>
                   </pic:nvPicPr>
                   <pic:blipFill>
-                    <a:blip r:embed="rId15"/>
+                    <a:blip r:embed="rId16"/>
                     <a:stretch>
                       <a:fillRect/>
                     </a:stretch>
@@ -1171,36 +2881,51 @@
     </w:p>
     <w:p>
       <w:pPr>
-        <w:pStyle w:val="ListParagraph"/>
-        <w:numPr>
-          <w:ilvl w:val="1"/>
-          <w:numId w:val="2"/>
-        </w:numPr>
-        <w:rPr>
-          <w:b/>
-        </w:rPr>
-      </w:pPr>
-      <w:r>
-        <w:rPr>
-          <w:b/>
-        </w:rPr>
-        <w:t xml:space="preserve"> Mockup</w:t>
-      </w:r>
-    </w:p>
-    <w:p>
-      <w:pPr>
-        <w:rPr>
-          <w:rFonts w:cs="Arial"/>
-          <w:szCs w:val="24"/>
-        </w:rPr>
-      </w:pPr>
-      <w:r>
-        <w:rPr>
-          <w:rFonts w:cs="Arial"/>
+        <w:jc w:val="center"/>
+        <w:rPr>
+          <w:rFonts w:cs="Arial"/>
+          <w:szCs w:val="24"/>
+        </w:rPr>
+      </w:pPr>
+    </w:p>
+    <w:p>
+      <w:pPr>
+        <w:pStyle w:val="Heading2"/>
+      </w:pPr>
+      <w:r>
+        <w:t xml:space="preserve"> </w:t>
+      </w:r>
+      <w:bookmarkStart w:id="10" w:name="_Toc229761542"/>
+      <w:r>
+        <w:t>History</w:t>
+      </w:r>
+      <w:bookmarkEnd w:id="10"/>
+    </w:p>
+    <w:p>
+      <w:pPr>
+        <w:rPr>
+          <w:rFonts w:ascii="-webkit-standard" w:hAnsi="-webkit-standard"/>
+          <w:color w:val="000000"/>
+          <w:szCs w:val="24"/>
+        </w:rPr>
+      </w:pPr>
+      <w:r>
+        <w:rPr>
+          <w:rFonts w:ascii="-webkit-standard" w:hAnsi="-webkit-standard"/>
+          <w:color w:val="000000"/>
           <w:szCs w:val="24"/>
         </w:rPr>
         <w:t>History page displaying previously generated tasks and user activity.</w:t>
       </w:r>
+    </w:p>
+    <w:p>
+      <w:pPr>
+        <w:rPr>
+          <w:rFonts w:ascii="-webkit-standard" w:hAnsi="-webkit-standard"/>
+          <w:color w:val="000000"/>
+          <w:szCs w:val="24"/>
+        </w:rPr>
+      </w:pPr>
     </w:p>
     <w:p>
       <w:pPr>
@@ -1232,7 +2957,7 @@
                     <pic:cNvPicPr/>
                   </pic:nvPicPr>
                   <pic:blipFill>
-                    <a:blip r:embed="rId16"/>
+                    <a:blip r:embed="rId17"/>
                     <a:stretch>
                       <a:fillRect/>
                     </a:stretch>
@@ -1265,7 +2990,7 @@
 </file>
 
 <file path=word/numbering.xml><?xml version="1.0" encoding="utf-8"?>
-<w:numbering xmlns:wpc="http://schemas.microsoft.com/office/word/2010/wordprocessingCanvas" xmlns:cx="http://schemas.microsoft.com/office/drawing/2014/chartex" xmlns:cx1="http://schemas.microsoft.com/office/drawing/2015/9/8/chartex" xmlns:mc="http://schemas.openxmlformats.org/markup-compatibility/2006" xmlns:o="urn:schemas-microsoft-com:office:office" xmlns:r="http://schemas.openxmlformats.org/officeDocument/2006/relationships" xmlns:m="http://schemas.openxmlformats.org/officeDocument/2006/math" xmlns:v="urn:schemas-microsoft-com:vml" xmlns:wp14="http://schemas.microsoft.com/office/word/2010/wordprocessingDrawing" xmlns:wp="http://schemas.openxmlformats.org/drawingml/2006/wordprocessingDrawing" xmlns:w10="urn:schemas-microsoft-com:office:word" xmlns:w="http://schemas.openxmlformats.org/wordprocessingml/2006/main" xmlns:w14="http://schemas.microsoft.com/office/word/2010/wordml" xmlns:w15="http://schemas.microsoft.com/office/word/2012/wordml" xmlns:w16se="http://schemas.microsoft.com/office/word/2015/wordml/symex" xmlns:wpg="http://schemas.microsoft.com/office/word/2010/wordprocessingGroup" xmlns:wpi="http://schemas.microsoft.com/office/word/2010/wordprocessingInk" xmlns:wne="http://schemas.microsoft.com/office/word/2006/wordml" xmlns:wps="http://schemas.microsoft.com/office/word/2010/wordprocessingShape" mc:Ignorable="w14 w15 w16se wp14">
+<w:numbering xmlns:wpc="http://schemas.microsoft.com/office/word/2010/wordprocessingCanvas" xmlns:cx="http://schemas.microsoft.com/office/drawing/2014/chartex" xmlns:cx1="http://schemas.microsoft.com/office/drawing/2015/9/8/chartex" xmlns:cx2="http://schemas.microsoft.com/office/drawing/2015/10/21/chartex" xmlns:cx3="http://schemas.microsoft.com/office/drawing/2016/5/9/chartex" xmlns:cx4="http://schemas.microsoft.com/office/drawing/2016/5/10/chartex" xmlns:cx5="http://schemas.microsoft.com/office/drawing/2016/5/11/chartex" xmlns:cx6="http://schemas.microsoft.com/office/drawing/2016/5/12/chartex" xmlns:cx7="http://schemas.microsoft.com/office/drawing/2016/5/13/chartex" xmlns:cx8="http://schemas.microsoft.com/office/drawing/2016/5/14/chartex" xmlns:mc="http://schemas.openxmlformats.org/markup-compatibility/2006" xmlns:aink="http://schemas.microsoft.com/office/drawing/2016/ink" xmlns:am3d="http://schemas.microsoft.com/office/drawing/2017/model3d" xmlns:o="urn:schemas-microsoft-com:office:office" xmlns:oel="http://schemas.microsoft.com/office/2019/extlst" xmlns:r="http://schemas.openxmlformats.org/officeDocument/2006/relationships" xmlns:m="http://schemas.openxmlformats.org/officeDocument/2006/math" xmlns:v="urn:schemas-microsoft-com:vml" xmlns:wp14="http://schemas.microsoft.com/office/word/2010/wordprocessingDrawing" xmlns:wp="http://schemas.openxmlformats.org/drawingml/2006/wordprocessingDrawing" xmlns:w10="urn:schemas-microsoft-com:office:word" xmlns:w="http://schemas.openxmlformats.org/wordprocessingml/2006/main" xmlns:w14="http://schemas.microsoft.com/office/word/2010/wordml" xmlns:w15="http://schemas.microsoft.com/office/word/2012/wordml" xmlns:w16cex="http://schemas.microsoft.com/office/word/2018/wordml/cex" xmlns:w16cid="http://schemas.microsoft.com/office/word/2016/wordml/cid" xmlns:w16="http://schemas.microsoft.com/office/word/2018/wordml" xmlns:w16du="http://schemas.microsoft.com/office/word/2023/wordml/word16du" xmlns:w16sdtdh="http://schemas.microsoft.com/office/word/2020/wordml/sdtdatahash" xmlns:w16sdtfl="http://schemas.microsoft.com/office/word/2024/wordml/sdtformatlock" xmlns:w16se="http://schemas.microsoft.com/office/word/2015/wordml/symex" xmlns:wpg="http://schemas.microsoft.com/office/word/2010/wordprocessingGroup" xmlns:wpi="http://schemas.microsoft.com/office/word/2010/wordprocessingInk" xmlns:wne="http://schemas.microsoft.com/office/word/2006/wordml" xmlns:wps="http://schemas.microsoft.com/office/word/2010/wordprocessingShape" mc:Ignorable="w14 w15 w16se w16cid w16 w16cex w16sdtdh w16sdtfl w16du wp14">
   <w:abstractNum w:abstractNumId="0" w15:restartNumberingAfterBreak="0">
     <w:nsid w:val="20A46177"/>
     <w:multiLevelType w:val="multilevel"/>
@@ -1476,17 +3201,655 @@
       </w:pPr>
     </w:lvl>
   </w:abstractNum>
-  <w:num w:numId="1">
+  <w:abstractNum w:abstractNumId="2" w15:restartNumberingAfterBreak="0">
+    <w:nsid w:val="36686DA9"/>
+    <w:multiLevelType w:val="hybridMultilevel"/>
+    <w:tmpl w:val="7182084E"/>
+    <w:lvl w:ilvl="0" w:tplc="04090001">
+      <w:start w:val="1"/>
+      <w:numFmt w:val="bullet"/>
+      <w:lvlText w:val=""/>
+      <w:lvlJc w:val="left"/>
+      <w:pPr>
+        <w:ind w:left="720" w:hanging="360"/>
+      </w:pPr>
+      <w:rPr>
+        <w:rFonts w:ascii="Symbol" w:hAnsi="Symbol" w:hint="default"/>
+      </w:rPr>
+    </w:lvl>
+    <w:lvl w:ilvl="1" w:tplc="04090003" w:tentative="1">
+      <w:start w:val="1"/>
+      <w:numFmt w:val="bullet"/>
+      <w:lvlText w:val="o"/>
+      <w:lvlJc w:val="left"/>
+      <w:pPr>
+        <w:ind w:left="1440" w:hanging="360"/>
+      </w:pPr>
+      <w:rPr>
+        <w:rFonts w:ascii="Courier New" w:hAnsi="Courier New" w:cs="Courier New" w:hint="default"/>
+      </w:rPr>
+    </w:lvl>
+    <w:lvl w:ilvl="2" w:tplc="04090005" w:tentative="1">
+      <w:start w:val="1"/>
+      <w:numFmt w:val="bullet"/>
+      <w:lvlText w:val=""/>
+      <w:lvlJc w:val="left"/>
+      <w:pPr>
+        <w:ind w:left="2160" w:hanging="360"/>
+      </w:pPr>
+      <w:rPr>
+        <w:rFonts w:ascii="Wingdings" w:hAnsi="Wingdings" w:hint="default"/>
+      </w:rPr>
+    </w:lvl>
+    <w:lvl w:ilvl="3" w:tplc="04090001" w:tentative="1">
+      <w:start w:val="1"/>
+      <w:numFmt w:val="bullet"/>
+      <w:lvlText w:val=""/>
+      <w:lvlJc w:val="left"/>
+      <w:pPr>
+        <w:ind w:left="2880" w:hanging="360"/>
+      </w:pPr>
+      <w:rPr>
+        <w:rFonts w:ascii="Symbol" w:hAnsi="Symbol" w:hint="default"/>
+      </w:rPr>
+    </w:lvl>
+    <w:lvl w:ilvl="4" w:tplc="04090003" w:tentative="1">
+      <w:start w:val="1"/>
+      <w:numFmt w:val="bullet"/>
+      <w:lvlText w:val="o"/>
+      <w:lvlJc w:val="left"/>
+      <w:pPr>
+        <w:ind w:left="3600" w:hanging="360"/>
+      </w:pPr>
+      <w:rPr>
+        <w:rFonts w:ascii="Courier New" w:hAnsi="Courier New" w:cs="Courier New" w:hint="default"/>
+      </w:rPr>
+    </w:lvl>
+    <w:lvl w:ilvl="5" w:tplc="04090005" w:tentative="1">
+      <w:start w:val="1"/>
+      <w:numFmt w:val="bullet"/>
+      <w:lvlText w:val=""/>
+      <w:lvlJc w:val="left"/>
+      <w:pPr>
+        <w:ind w:left="4320" w:hanging="360"/>
+      </w:pPr>
+      <w:rPr>
+        <w:rFonts w:ascii="Wingdings" w:hAnsi="Wingdings" w:hint="default"/>
+      </w:rPr>
+    </w:lvl>
+    <w:lvl w:ilvl="6" w:tplc="04090001" w:tentative="1">
+      <w:start w:val="1"/>
+      <w:numFmt w:val="bullet"/>
+      <w:lvlText w:val=""/>
+      <w:lvlJc w:val="left"/>
+      <w:pPr>
+        <w:ind w:left="5040" w:hanging="360"/>
+      </w:pPr>
+      <w:rPr>
+        <w:rFonts w:ascii="Symbol" w:hAnsi="Symbol" w:hint="default"/>
+      </w:rPr>
+    </w:lvl>
+    <w:lvl w:ilvl="7" w:tplc="04090003" w:tentative="1">
+      <w:start w:val="1"/>
+      <w:numFmt w:val="bullet"/>
+      <w:lvlText w:val="o"/>
+      <w:lvlJc w:val="left"/>
+      <w:pPr>
+        <w:ind w:left="5760" w:hanging="360"/>
+      </w:pPr>
+      <w:rPr>
+        <w:rFonts w:ascii="Courier New" w:hAnsi="Courier New" w:cs="Courier New" w:hint="default"/>
+      </w:rPr>
+    </w:lvl>
+    <w:lvl w:ilvl="8" w:tplc="04090005" w:tentative="1">
+      <w:start w:val="1"/>
+      <w:numFmt w:val="bullet"/>
+      <w:lvlText w:val=""/>
+      <w:lvlJc w:val="left"/>
+      <w:pPr>
+        <w:ind w:left="6480" w:hanging="360"/>
+      </w:pPr>
+      <w:rPr>
+        <w:rFonts w:ascii="Wingdings" w:hAnsi="Wingdings" w:hint="default"/>
+      </w:rPr>
+    </w:lvl>
+  </w:abstractNum>
+  <w:abstractNum w:abstractNumId="3" w15:restartNumberingAfterBreak="0">
+    <w:nsid w:val="3B376B05"/>
+    <w:multiLevelType w:val="hybridMultilevel"/>
+    <w:tmpl w:val="425A0ACA"/>
+    <w:lvl w:ilvl="0" w:tplc="F50A345E">
+      <w:start w:val="1"/>
+      <w:numFmt w:val="decimal"/>
+      <w:lvlText w:val="%1"/>
+      <w:lvlJc w:val="left"/>
+      <w:pPr>
+        <w:ind w:left="720" w:hanging="360"/>
+      </w:pPr>
+      <w:rPr>
+        <w:rFonts w:hint="default"/>
+      </w:rPr>
+    </w:lvl>
+    <w:lvl w:ilvl="1" w:tplc="04090019" w:tentative="1">
+      <w:start w:val="1"/>
+      <w:numFmt w:val="lowerLetter"/>
+      <w:lvlText w:val="%2."/>
+      <w:lvlJc w:val="left"/>
+      <w:pPr>
+        <w:ind w:left="1440" w:hanging="360"/>
+      </w:pPr>
+    </w:lvl>
+    <w:lvl w:ilvl="2" w:tplc="0409001B" w:tentative="1">
+      <w:start w:val="1"/>
+      <w:numFmt w:val="lowerRoman"/>
+      <w:lvlText w:val="%3."/>
+      <w:lvlJc w:val="right"/>
+      <w:pPr>
+        <w:ind w:left="2160" w:hanging="180"/>
+      </w:pPr>
+    </w:lvl>
+    <w:lvl w:ilvl="3" w:tplc="0409000F" w:tentative="1">
+      <w:start w:val="1"/>
+      <w:numFmt w:val="decimal"/>
+      <w:lvlText w:val="%4."/>
+      <w:lvlJc w:val="left"/>
+      <w:pPr>
+        <w:ind w:left="2880" w:hanging="360"/>
+      </w:pPr>
+    </w:lvl>
+    <w:lvl w:ilvl="4" w:tplc="04090019" w:tentative="1">
+      <w:start w:val="1"/>
+      <w:numFmt w:val="lowerLetter"/>
+      <w:lvlText w:val="%5."/>
+      <w:lvlJc w:val="left"/>
+      <w:pPr>
+        <w:ind w:left="3600" w:hanging="360"/>
+      </w:pPr>
+    </w:lvl>
+    <w:lvl w:ilvl="5" w:tplc="0409001B" w:tentative="1">
+      <w:start w:val="1"/>
+      <w:numFmt w:val="lowerRoman"/>
+      <w:lvlText w:val="%6."/>
+      <w:lvlJc w:val="right"/>
+      <w:pPr>
+        <w:ind w:left="4320" w:hanging="180"/>
+      </w:pPr>
+    </w:lvl>
+    <w:lvl w:ilvl="6" w:tplc="0409000F" w:tentative="1">
+      <w:start w:val="1"/>
+      <w:numFmt w:val="decimal"/>
+      <w:lvlText w:val="%7."/>
+      <w:lvlJc w:val="left"/>
+      <w:pPr>
+        <w:ind w:left="5040" w:hanging="360"/>
+      </w:pPr>
+    </w:lvl>
+    <w:lvl w:ilvl="7" w:tplc="04090019" w:tentative="1">
+      <w:start w:val="1"/>
+      <w:numFmt w:val="lowerLetter"/>
+      <w:lvlText w:val="%8."/>
+      <w:lvlJc w:val="left"/>
+      <w:pPr>
+        <w:ind w:left="5760" w:hanging="360"/>
+      </w:pPr>
+    </w:lvl>
+    <w:lvl w:ilvl="8" w:tplc="0409001B" w:tentative="1">
+      <w:start w:val="1"/>
+      <w:numFmt w:val="lowerRoman"/>
+      <w:lvlText w:val="%9."/>
+      <w:lvlJc w:val="right"/>
+      <w:pPr>
+        <w:ind w:left="6480" w:hanging="180"/>
+      </w:pPr>
+    </w:lvl>
+  </w:abstractNum>
+  <w:abstractNum w:abstractNumId="4" w15:restartNumberingAfterBreak="0">
+    <w:nsid w:val="5CD93F3C"/>
+    <w:multiLevelType w:val="multilevel"/>
+    <w:tmpl w:val="0F0E0D0E"/>
+    <w:lvl w:ilvl="0">
+      <w:start w:val="1"/>
+      <w:numFmt w:val="decimal"/>
+      <w:pStyle w:val="Heading1"/>
+      <w:lvlText w:val="%1"/>
+      <w:lvlJc w:val="left"/>
+      <w:pPr>
+        <w:ind w:left="432" w:hanging="432"/>
+      </w:pPr>
+    </w:lvl>
+    <w:lvl w:ilvl="1">
+      <w:start w:val="1"/>
+      <w:numFmt w:val="decimal"/>
+      <w:pStyle w:val="Heading2"/>
+      <w:lvlText w:val="%1.%2"/>
+      <w:lvlJc w:val="left"/>
+      <w:pPr>
+        <w:ind w:left="576" w:hanging="576"/>
+      </w:pPr>
+    </w:lvl>
+    <w:lvl w:ilvl="2">
+      <w:start w:val="1"/>
+      <w:numFmt w:val="decimal"/>
+      <w:pStyle w:val="Heading3"/>
+      <w:lvlText w:val="%1.%2.%3"/>
+      <w:lvlJc w:val="left"/>
+      <w:pPr>
+        <w:ind w:left="720" w:hanging="720"/>
+      </w:pPr>
+    </w:lvl>
+    <w:lvl w:ilvl="3">
+      <w:start w:val="1"/>
+      <w:numFmt w:val="decimal"/>
+      <w:pStyle w:val="Heading4"/>
+      <w:lvlText w:val="%1.%2.%3.%4"/>
+      <w:lvlJc w:val="left"/>
+      <w:pPr>
+        <w:ind w:left="864" w:hanging="864"/>
+      </w:pPr>
+    </w:lvl>
+    <w:lvl w:ilvl="4">
+      <w:start w:val="1"/>
+      <w:numFmt w:val="decimal"/>
+      <w:pStyle w:val="Heading5"/>
+      <w:lvlText w:val="%1.%2.%3.%4.%5"/>
+      <w:lvlJc w:val="left"/>
+      <w:pPr>
+        <w:ind w:left="1008" w:hanging="1008"/>
+      </w:pPr>
+    </w:lvl>
+    <w:lvl w:ilvl="5">
+      <w:start w:val="1"/>
+      <w:numFmt w:val="decimal"/>
+      <w:pStyle w:val="Heading6"/>
+      <w:lvlText w:val="%1.%2.%3.%4.%5.%6"/>
+      <w:lvlJc w:val="left"/>
+      <w:pPr>
+        <w:ind w:left="1152" w:hanging="1152"/>
+      </w:pPr>
+    </w:lvl>
+    <w:lvl w:ilvl="6">
+      <w:start w:val="1"/>
+      <w:numFmt w:val="decimal"/>
+      <w:pStyle w:val="Heading7"/>
+      <w:lvlText w:val="%1.%2.%3.%4.%5.%6.%7"/>
+      <w:lvlJc w:val="left"/>
+      <w:pPr>
+        <w:ind w:left="1296" w:hanging="1296"/>
+      </w:pPr>
+    </w:lvl>
+    <w:lvl w:ilvl="7">
+      <w:start w:val="1"/>
+      <w:numFmt w:val="decimal"/>
+      <w:pStyle w:val="Heading8"/>
+      <w:lvlText w:val="%1.%2.%3.%4.%5.%6.%7.%8"/>
+      <w:lvlJc w:val="left"/>
+      <w:pPr>
+        <w:ind w:left="1440" w:hanging="1440"/>
+      </w:pPr>
+    </w:lvl>
+    <w:lvl w:ilvl="8">
+      <w:start w:val="1"/>
+      <w:numFmt w:val="decimal"/>
+      <w:pStyle w:val="Heading9"/>
+      <w:lvlText w:val="%1.%2.%3.%4.%5.%6.%7.%8.%9"/>
+      <w:lvlJc w:val="left"/>
+      <w:pPr>
+        <w:ind w:left="1584" w:hanging="1584"/>
+      </w:pPr>
+    </w:lvl>
+  </w:abstractNum>
+  <w:abstractNum w:abstractNumId="5" w15:restartNumberingAfterBreak="0">
+    <w:nsid w:val="6D4C5E3F"/>
+    <w:multiLevelType w:val="hybridMultilevel"/>
+    <w:tmpl w:val="4B7ADE5E"/>
+    <w:lvl w:ilvl="0" w:tplc="0409000F">
+      <w:start w:val="1"/>
+      <w:numFmt w:val="decimal"/>
+      <w:lvlText w:val="%1."/>
+      <w:lvlJc w:val="left"/>
+      <w:pPr>
+        <w:ind w:left="720" w:hanging="360"/>
+      </w:pPr>
+      <w:rPr>
+        <w:rFonts w:hint="default"/>
+      </w:rPr>
+    </w:lvl>
+    <w:lvl w:ilvl="1" w:tplc="04090019" w:tentative="1">
+      <w:start w:val="1"/>
+      <w:numFmt w:val="lowerLetter"/>
+      <w:lvlText w:val="%2."/>
+      <w:lvlJc w:val="left"/>
+      <w:pPr>
+        <w:ind w:left="1440" w:hanging="360"/>
+      </w:pPr>
+    </w:lvl>
+    <w:lvl w:ilvl="2" w:tplc="0409001B" w:tentative="1">
+      <w:start w:val="1"/>
+      <w:numFmt w:val="lowerRoman"/>
+      <w:lvlText w:val="%3."/>
+      <w:lvlJc w:val="right"/>
+      <w:pPr>
+        <w:ind w:left="2160" w:hanging="180"/>
+      </w:pPr>
+    </w:lvl>
+    <w:lvl w:ilvl="3" w:tplc="0409000F" w:tentative="1">
+      <w:start w:val="1"/>
+      <w:numFmt w:val="decimal"/>
+      <w:lvlText w:val="%4."/>
+      <w:lvlJc w:val="left"/>
+      <w:pPr>
+        <w:ind w:left="2880" w:hanging="360"/>
+      </w:pPr>
+    </w:lvl>
+    <w:lvl w:ilvl="4" w:tplc="04090019" w:tentative="1">
+      <w:start w:val="1"/>
+      <w:numFmt w:val="lowerLetter"/>
+      <w:lvlText w:val="%5."/>
+      <w:lvlJc w:val="left"/>
+      <w:pPr>
+        <w:ind w:left="3600" w:hanging="360"/>
+      </w:pPr>
+    </w:lvl>
+    <w:lvl w:ilvl="5" w:tplc="0409001B" w:tentative="1">
+      <w:start w:val="1"/>
+      <w:numFmt w:val="lowerRoman"/>
+      <w:lvlText w:val="%6."/>
+      <w:lvlJc w:val="right"/>
+      <w:pPr>
+        <w:ind w:left="4320" w:hanging="180"/>
+      </w:pPr>
+    </w:lvl>
+    <w:lvl w:ilvl="6" w:tplc="0409000F" w:tentative="1">
+      <w:start w:val="1"/>
+      <w:numFmt w:val="decimal"/>
+      <w:lvlText w:val="%7."/>
+      <w:lvlJc w:val="left"/>
+      <w:pPr>
+        <w:ind w:left="5040" w:hanging="360"/>
+      </w:pPr>
+    </w:lvl>
+    <w:lvl w:ilvl="7" w:tplc="04090019" w:tentative="1">
+      <w:start w:val="1"/>
+      <w:numFmt w:val="lowerLetter"/>
+      <w:lvlText w:val="%8."/>
+      <w:lvlJc w:val="left"/>
+      <w:pPr>
+        <w:ind w:left="5760" w:hanging="360"/>
+      </w:pPr>
+    </w:lvl>
+    <w:lvl w:ilvl="8" w:tplc="0409001B" w:tentative="1">
+      <w:start w:val="1"/>
+      <w:numFmt w:val="lowerRoman"/>
+      <w:lvlText w:val="%9."/>
+      <w:lvlJc w:val="right"/>
+      <w:pPr>
+        <w:ind w:left="6480" w:hanging="180"/>
+      </w:pPr>
+    </w:lvl>
+  </w:abstractNum>
+  <w:abstractNum w:abstractNumId="6" w15:restartNumberingAfterBreak="0">
+    <w:nsid w:val="754C3FE3"/>
+    <w:multiLevelType w:val="hybridMultilevel"/>
+    <w:tmpl w:val="33825EE2"/>
+    <w:lvl w:ilvl="0" w:tplc="04090001">
+      <w:start w:val="1"/>
+      <w:numFmt w:val="bullet"/>
+      <w:lvlText w:val=""/>
+      <w:lvlJc w:val="left"/>
+      <w:pPr>
+        <w:ind w:left="720" w:hanging="360"/>
+      </w:pPr>
+      <w:rPr>
+        <w:rFonts w:ascii="Symbol" w:hAnsi="Symbol" w:hint="default"/>
+      </w:rPr>
+    </w:lvl>
+    <w:lvl w:ilvl="1" w:tplc="04090003" w:tentative="1">
+      <w:start w:val="1"/>
+      <w:numFmt w:val="bullet"/>
+      <w:lvlText w:val="o"/>
+      <w:lvlJc w:val="left"/>
+      <w:pPr>
+        <w:ind w:left="1440" w:hanging="360"/>
+      </w:pPr>
+      <w:rPr>
+        <w:rFonts w:ascii="Courier New" w:hAnsi="Courier New" w:cs="Courier New" w:hint="default"/>
+      </w:rPr>
+    </w:lvl>
+    <w:lvl w:ilvl="2" w:tplc="04090005" w:tentative="1">
+      <w:start w:val="1"/>
+      <w:numFmt w:val="bullet"/>
+      <w:lvlText w:val=""/>
+      <w:lvlJc w:val="left"/>
+      <w:pPr>
+        <w:ind w:left="2160" w:hanging="360"/>
+      </w:pPr>
+      <w:rPr>
+        <w:rFonts w:ascii="Wingdings" w:hAnsi="Wingdings" w:hint="default"/>
+      </w:rPr>
+    </w:lvl>
+    <w:lvl w:ilvl="3" w:tplc="04090001" w:tentative="1">
+      <w:start w:val="1"/>
+      <w:numFmt w:val="bullet"/>
+      <w:lvlText w:val=""/>
+      <w:lvlJc w:val="left"/>
+      <w:pPr>
+        <w:ind w:left="2880" w:hanging="360"/>
+      </w:pPr>
+      <w:rPr>
+        <w:rFonts w:ascii="Symbol" w:hAnsi="Symbol" w:hint="default"/>
+      </w:rPr>
+    </w:lvl>
+    <w:lvl w:ilvl="4" w:tplc="04090003" w:tentative="1">
+      <w:start w:val="1"/>
+      <w:numFmt w:val="bullet"/>
+      <w:lvlText w:val="o"/>
+      <w:lvlJc w:val="left"/>
+      <w:pPr>
+        <w:ind w:left="3600" w:hanging="360"/>
+      </w:pPr>
+      <w:rPr>
+        <w:rFonts w:ascii="Courier New" w:hAnsi="Courier New" w:cs="Courier New" w:hint="default"/>
+      </w:rPr>
+    </w:lvl>
+    <w:lvl w:ilvl="5" w:tplc="04090005" w:tentative="1">
+      <w:start w:val="1"/>
+      <w:numFmt w:val="bullet"/>
+      <w:lvlText w:val=""/>
+      <w:lvlJc w:val="left"/>
+      <w:pPr>
+        <w:ind w:left="4320" w:hanging="360"/>
+      </w:pPr>
+      <w:rPr>
+        <w:rFonts w:ascii="Wingdings" w:hAnsi="Wingdings" w:hint="default"/>
+      </w:rPr>
+    </w:lvl>
+    <w:lvl w:ilvl="6" w:tplc="04090001" w:tentative="1">
+      <w:start w:val="1"/>
+      <w:numFmt w:val="bullet"/>
+      <w:lvlText w:val=""/>
+      <w:lvlJc w:val="left"/>
+      <w:pPr>
+        <w:ind w:left="5040" w:hanging="360"/>
+      </w:pPr>
+      <w:rPr>
+        <w:rFonts w:ascii="Symbol" w:hAnsi="Symbol" w:hint="default"/>
+      </w:rPr>
+    </w:lvl>
+    <w:lvl w:ilvl="7" w:tplc="04090003" w:tentative="1">
+      <w:start w:val="1"/>
+      <w:numFmt w:val="bullet"/>
+      <w:lvlText w:val="o"/>
+      <w:lvlJc w:val="left"/>
+      <w:pPr>
+        <w:ind w:left="5760" w:hanging="360"/>
+      </w:pPr>
+      <w:rPr>
+        <w:rFonts w:ascii="Courier New" w:hAnsi="Courier New" w:cs="Courier New" w:hint="default"/>
+      </w:rPr>
+    </w:lvl>
+    <w:lvl w:ilvl="8" w:tplc="04090005" w:tentative="1">
+      <w:start w:val="1"/>
+      <w:numFmt w:val="bullet"/>
+      <w:lvlText w:val=""/>
+      <w:lvlJc w:val="left"/>
+      <w:pPr>
+        <w:ind w:left="6480" w:hanging="360"/>
+      </w:pPr>
+      <w:rPr>
+        <w:rFonts w:ascii="Wingdings" w:hAnsi="Wingdings" w:hint="default"/>
+      </w:rPr>
+    </w:lvl>
+  </w:abstractNum>
+  <w:abstractNum w:abstractNumId="7" w15:restartNumberingAfterBreak="0">
+    <w:nsid w:val="7C7327D6"/>
+    <w:multiLevelType w:val="multilevel"/>
+    <w:tmpl w:val="E6388B6C"/>
+    <w:lvl w:ilvl="0">
+      <w:start w:val="1"/>
+      <w:numFmt w:val="decimal"/>
+      <w:lvlText w:val="%1."/>
+      <w:lvlJc w:val="left"/>
+      <w:pPr>
+        <w:ind w:left="360" w:hanging="360"/>
+      </w:pPr>
+      <w:rPr>
+        <w:rFonts w:hint="default"/>
+      </w:rPr>
+    </w:lvl>
+    <w:lvl w:ilvl="1">
+      <w:start w:val="2"/>
+      <w:numFmt w:val="decimal"/>
+      <w:isLgl/>
+      <w:lvlText w:val="%1.%2"/>
+      <w:lvlJc w:val="left"/>
+      <w:pPr>
+        <w:ind w:left="360" w:hanging="360"/>
+      </w:pPr>
+      <w:rPr>
+        <w:rFonts w:hint="default"/>
+      </w:rPr>
+    </w:lvl>
+    <w:lvl w:ilvl="2">
+      <w:start w:val="1"/>
+      <w:numFmt w:val="decimal"/>
+      <w:isLgl/>
+      <w:lvlText w:val="%1.%2.%3"/>
+      <w:lvlJc w:val="left"/>
+      <w:pPr>
+        <w:ind w:left="720" w:hanging="720"/>
+      </w:pPr>
+      <w:rPr>
+        <w:rFonts w:hint="default"/>
+      </w:rPr>
+    </w:lvl>
+    <w:lvl w:ilvl="3">
+      <w:start w:val="1"/>
+      <w:numFmt w:val="decimal"/>
+      <w:isLgl/>
+      <w:lvlText w:val="%1.%2.%3.%4"/>
+      <w:lvlJc w:val="left"/>
+      <w:pPr>
+        <w:ind w:left="720" w:hanging="720"/>
+      </w:pPr>
+      <w:rPr>
+        <w:rFonts w:hint="default"/>
+      </w:rPr>
+    </w:lvl>
+    <w:lvl w:ilvl="4">
+      <w:start w:val="1"/>
+      <w:numFmt w:val="decimal"/>
+      <w:isLgl/>
+      <w:lvlText w:val="%1.%2.%3.%4.%5"/>
+      <w:lvlJc w:val="left"/>
+      <w:pPr>
+        <w:ind w:left="1080" w:hanging="1080"/>
+      </w:pPr>
+      <w:rPr>
+        <w:rFonts w:hint="default"/>
+      </w:rPr>
+    </w:lvl>
+    <w:lvl w:ilvl="5">
+      <w:start w:val="1"/>
+      <w:numFmt w:val="decimal"/>
+      <w:isLgl/>
+      <w:lvlText w:val="%1.%2.%3.%4.%5.%6"/>
+      <w:lvlJc w:val="left"/>
+      <w:pPr>
+        <w:ind w:left="1440" w:hanging="1440"/>
+      </w:pPr>
+      <w:rPr>
+        <w:rFonts w:hint="default"/>
+      </w:rPr>
+    </w:lvl>
+    <w:lvl w:ilvl="6">
+      <w:start w:val="1"/>
+      <w:numFmt w:val="decimal"/>
+      <w:isLgl/>
+      <w:lvlText w:val="%1.%2.%3.%4.%5.%6.%7"/>
+      <w:lvlJc w:val="left"/>
+      <w:pPr>
+        <w:ind w:left="1440" w:hanging="1440"/>
+      </w:pPr>
+      <w:rPr>
+        <w:rFonts w:hint="default"/>
+      </w:rPr>
+    </w:lvl>
+    <w:lvl w:ilvl="7">
+      <w:start w:val="1"/>
+      <w:numFmt w:val="decimal"/>
+      <w:isLgl/>
+      <w:lvlText w:val="%1.%2.%3.%4.%5.%6.%7.%8"/>
+      <w:lvlJc w:val="left"/>
+      <w:pPr>
+        <w:ind w:left="1800" w:hanging="1800"/>
+      </w:pPr>
+      <w:rPr>
+        <w:rFonts w:hint="default"/>
+      </w:rPr>
+    </w:lvl>
+    <w:lvl w:ilvl="8">
+      <w:start w:val="1"/>
+      <w:numFmt w:val="decimal"/>
+      <w:isLgl/>
+      <w:lvlText w:val="%1.%2.%3.%4.%5.%6.%7.%8.%9"/>
+      <w:lvlJc w:val="left"/>
+      <w:pPr>
+        <w:ind w:left="1800" w:hanging="1800"/>
+      </w:pPr>
+      <w:rPr>
+        <w:rFonts w:hint="default"/>
+      </w:rPr>
+    </w:lvl>
+  </w:abstractNum>
+  <w:num w:numId="1" w16cid:durableId="1700398547">
     <w:abstractNumId w:val="1"/>
   </w:num>
-  <w:num w:numId="2">
+  <w:num w:numId="2" w16cid:durableId="974943350">
     <w:abstractNumId w:val="0"/>
+  </w:num>
+  <w:num w:numId="3" w16cid:durableId="1887523636">
+    <w:abstractNumId w:val="2"/>
+  </w:num>
+  <w:num w:numId="4" w16cid:durableId="1284187911">
+    <w:abstractNumId w:val="6"/>
+  </w:num>
+  <w:num w:numId="5" w16cid:durableId="1745059295">
+    <w:abstractNumId w:val="5"/>
+  </w:num>
+  <w:num w:numId="6" w16cid:durableId="913011585">
+    <w:abstractNumId w:val="3"/>
+  </w:num>
+  <w:num w:numId="7" w16cid:durableId="1543906868">
+    <w:abstractNumId w:val="7"/>
+  </w:num>
+  <w:num w:numId="8" w16cid:durableId="286353904">
+    <w:abstractNumId w:val="4"/>
   </w:num>
 </w:numbering>
 </file>
 
 <file path=word/styles.xml><?xml version="1.0" encoding="utf-8"?>
-<w:styles xmlns:mc="http://schemas.openxmlformats.org/markup-compatibility/2006" xmlns:r="http://schemas.openxmlformats.org/officeDocument/2006/relationships" xmlns:w="http://schemas.openxmlformats.org/wordprocessingml/2006/main" xmlns:w14="http://schemas.microsoft.com/office/word/2010/wordml" xmlns:w15="http://schemas.microsoft.com/office/word/2012/wordml" xmlns:w16se="http://schemas.microsoft.com/office/word/2015/wordml/symex" mc:Ignorable="w14 w15 w16se">
+<w:styles xmlns:mc="http://schemas.openxmlformats.org/markup-compatibility/2006" xmlns:r="http://schemas.openxmlformats.org/officeDocument/2006/relationships" xmlns:w="http://schemas.openxmlformats.org/wordprocessingml/2006/main" xmlns:w14="http://schemas.microsoft.com/office/word/2010/wordml" xmlns:w15="http://schemas.microsoft.com/office/word/2012/wordml" xmlns:w16cex="http://schemas.microsoft.com/office/word/2018/wordml/cex" xmlns:w16cid="http://schemas.microsoft.com/office/word/2016/wordml/cid" xmlns:w16="http://schemas.microsoft.com/office/word/2018/wordml" xmlns:w16du="http://schemas.microsoft.com/office/word/2023/wordml/word16du" xmlns:w16sdtdh="http://schemas.microsoft.com/office/word/2020/wordml/sdtdatahash" xmlns:w16sdtfl="http://schemas.microsoft.com/office/word/2024/wordml/sdtformatlock" xmlns:w16se="http://schemas.microsoft.com/office/word/2015/wordml/symex" mc:Ignorable="w14 w15 w16se w16cid w16 w16cex w16sdtdh w16sdtfl w16du">
   <w:docDefaults>
     <w:rPrDefault>
       <w:rPr>
@@ -1502,7 +3865,7 @@
       </w:pPr>
     </w:pPrDefault>
   </w:docDefaults>
-  <w:latentStyles w:defLockedState="0" w:defUIPriority="99" w:defSemiHidden="0" w:defUnhideWhenUsed="0" w:defQFormat="0" w:count="371">
+  <w:latentStyles w:defLockedState="0" w:defUIPriority="99" w:defSemiHidden="0" w:defUnhideWhenUsed="0" w:defQFormat="0" w:count="376">
     <w:lsdException w:name="Normal" w:uiPriority="0" w:qFormat="1"/>
     <w:lsdException w:name="heading 1" w:uiPriority="9" w:qFormat="1"/>
     <w:lsdException w:name="heading 2" w:semiHidden="1" w:uiPriority="9" w:unhideWhenUsed="1" w:qFormat="1"/>
@@ -1874,6 +4237,11 @@
     <w:lsdException w:name="List Table 5 Dark Accent 6" w:uiPriority="50"/>
     <w:lsdException w:name="List Table 6 Colorful Accent 6" w:uiPriority="51"/>
     <w:lsdException w:name="List Table 7 Colorful Accent 6" w:uiPriority="52"/>
+    <w:lsdException w:name="Mention" w:semiHidden="1" w:unhideWhenUsed="1"/>
+    <w:lsdException w:name="Smart Hyperlink" w:semiHidden="1" w:unhideWhenUsed="1"/>
+    <w:lsdException w:name="Hashtag" w:semiHidden="1" w:unhideWhenUsed="1"/>
+    <w:lsdException w:name="Unresolved Mention" w:semiHidden="1" w:unhideWhenUsed="1"/>
+    <w:lsdException w:name="Smart Link" w:semiHidden="1" w:unhideWhenUsed="1"/>
   </w:latentStyles>
   <w:style w:type="paragraph" w:default="1" w:styleId="Normal">
     <w:name w:val="Normal"/>
@@ -1898,6 +4266,9 @@
     <w:pPr>
       <w:keepNext/>
       <w:keepLines/>
+      <w:numPr>
+        <w:numId w:val="8"/>
+      </w:numPr>
       <w:spacing w:before="480" w:after="0"/>
       <w:outlineLvl w:val="0"/>
     </w:pPr>
@@ -1922,6 +4293,10 @@
     <w:pPr>
       <w:keepNext/>
       <w:keepLines/>
+      <w:numPr>
+        <w:ilvl w:val="1"/>
+        <w:numId w:val="8"/>
+      </w:numPr>
       <w:spacing w:before="200" w:after="0"/>
       <w:outlineLvl w:val="1"/>
     </w:pPr>
@@ -1946,6 +4321,10 @@
     <w:pPr>
       <w:keepNext/>
       <w:keepLines/>
+      <w:numPr>
+        <w:ilvl w:val="2"/>
+        <w:numId w:val="8"/>
+      </w:numPr>
       <w:spacing w:before="200" w:after="0"/>
       <w:outlineLvl w:val="2"/>
     </w:pPr>
@@ -1954,6 +4333,166 @@
       <w:b/>
       <w:bCs/>
       <w:color w:val="5B9BD5" w:themeColor="accent1"/>
+    </w:rPr>
+  </w:style>
+  <w:style w:type="paragraph" w:styleId="Heading4">
+    <w:name w:val="heading 4"/>
+    <w:basedOn w:val="Normal"/>
+    <w:next w:val="Normal"/>
+    <w:link w:val="Heading4Char"/>
+    <w:uiPriority w:val="9"/>
+    <w:semiHidden/>
+    <w:unhideWhenUsed/>
+    <w:qFormat/>
+    <w:rsid w:val="00837EEC"/>
+    <w:pPr>
+      <w:keepNext/>
+      <w:keepLines/>
+      <w:numPr>
+        <w:ilvl w:val="3"/>
+        <w:numId w:val="8"/>
+      </w:numPr>
+      <w:spacing w:before="40" w:after="0"/>
+      <w:outlineLvl w:val="3"/>
+    </w:pPr>
+    <w:rPr>
+      <w:rFonts w:asciiTheme="majorHAnsi" w:eastAsiaTheme="majorEastAsia" w:hAnsiTheme="majorHAnsi" w:cstheme="majorBidi"/>
+      <w:i/>
+      <w:iCs/>
+      <w:color w:val="2E74B5" w:themeColor="accent1" w:themeShade="BF"/>
+    </w:rPr>
+  </w:style>
+  <w:style w:type="paragraph" w:styleId="Heading5">
+    <w:name w:val="heading 5"/>
+    <w:basedOn w:val="Normal"/>
+    <w:next w:val="Normal"/>
+    <w:link w:val="Heading5Char"/>
+    <w:uiPriority w:val="9"/>
+    <w:semiHidden/>
+    <w:unhideWhenUsed/>
+    <w:qFormat/>
+    <w:rsid w:val="00837EEC"/>
+    <w:pPr>
+      <w:keepNext/>
+      <w:keepLines/>
+      <w:numPr>
+        <w:ilvl w:val="4"/>
+        <w:numId w:val="8"/>
+      </w:numPr>
+      <w:spacing w:before="40" w:after="0"/>
+      <w:outlineLvl w:val="4"/>
+    </w:pPr>
+    <w:rPr>
+      <w:rFonts w:asciiTheme="majorHAnsi" w:eastAsiaTheme="majorEastAsia" w:hAnsiTheme="majorHAnsi" w:cstheme="majorBidi"/>
+      <w:color w:val="2E74B5" w:themeColor="accent1" w:themeShade="BF"/>
+    </w:rPr>
+  </w:style>
+  <w:style w:type="paragraph" w:styleId="Heading6">
+    <w:name w:val="heading 6"/>
+    <w:basedOn w:val="Normal"/>
+    <w:next w:val="Normal"/>
+    <w:link w:val="Heading6Char"/>
+    <w:uiPriority w:val="9"/>
+    <w:semiHidden/>
+    <w:unhideWhenUsed/>
+    <w:qFormat/>
+    <w:rsid w:val="00837EEC"/>
+    <w:pPr>
+      <w:keepNext/>
+      <w:keepLines/>
+      <w:numPr>
+        <w:ilvl w:val="5"/>
+        <w:numId w:val="8"/>
+      </w:numPr>
+      <w:spacing w:before="40" w:after="0"/>
+      <w:outlineLvl w:val="5"/>
+    </w:pPr>
+    <w:rPr>
+      <w:rFonts w:asciiTheme="majorHAnsi" w:eastAsiaTheme="majorEastAsia" w:hAnsiTheme="majorHAnsi" w:cstheme="majorBidi"/>
+      <w:color w:val="1F4D78" w:themeColor="accent1" w:themeShade="7F"/>
+    </w:rPr>
+  </w:style>
+  <w:style w:type="paragraph" w:styleId="Heading7">
+    <w:name w:val="heading 7"/>
+    <w:basedOn w:val="Normal"/>
+    <w:next w:val="Normal"/>
+    <w:link w:val="Heading7Char"/>
+    <w:uiPriority w:val="9"/>
+    <w:semiHidden/>
+    <w:unhideWhenUsed/>
+    <w:qFormat/>
+    <w:rsid w:val="00837EEC"/>
+    <w:pPr>
+      <w:keepNext/>
+      <w:keepLines/>
+      <w:numPr>
+        <w:ilvl w:val="6"/>
+        <w:numId w:val="8"/>
+      </w:numPr>
+      <w:spacing w:before="40" w:after="0"/>
+      <w:outlineLvl w:val="6"/>
+    </w:pPr>
+    <w:rPr>
+      <w:rFonts w:asciiTheme="majorHAnsi" w:eastAsiaTheme="majorEastAsia" w:hAnsiTheme="majorHAnsi" w:cstheme="majorBidi"/>
+      <w:i/>
+      <w:iCs/>
+      <w:color w:val="1F4D78" w:themeColor="accent1" w:themeShade="7F"/>
+    </w:rPr>
+  </w:style>
+  <w:style w:type="paragraph" w:styleId="Heading8">
+    <w:name w:val="heading 8"/>
+    <w:basedOn w:val="Normal"/>
+    <w:next w:val="Normal"/>
+    <w:link w:val="Heading8Char"/>
+    <w:uiPriority w:val="9"/>
+    <w:semiHidden/>
+    <w:unhideWhenUsed/>
+    <w:qFormat/>
+    <w:rsid w:val="00837EEC"/>
+    <w:pPr>
+      <w:keepNext/>
+      <w:keepLines/>
+      <w:numPr>
+        <w:ilvl w:val="7"/>
+        <w:numId w:val="8"/>
+      </w:numPr>
+      <w:spacing w:before="40" w:after="0"/>
+      <w:outlineLvl w:val="7"/>
+    </w:pPr>
+    <w:rPr>
+      <w:rFonts w:asciiTheme="majorHAnsi" w:eastAsiaTheme="majorEastAsia" w:hAnsiTheme="majorHAnsi" w:cstheme="majorBidi"/>
+      <w:color w:val="272727" w:themeColor="text1" w:themeTint="D8"/>
+      <w:sz w:val="21"/>
+      <w:szCs w:val="21"/>
+    </w:rPr>
+  </w:style>
+  <w:style w:type="paragraph" w:styleId="Heading9">
+    <w:name w:val="heading 9"/>
+    <w:basedOn w:val="Normal"/>
+    <w:next w:val="Normal"/>
+    <w:link w:val="Heading9Char"/>
+    <w:uiPriority w:val="9"/>
+    <w:semiHidden/>
+    <w:unhideWhenUsed/>
+    <w:qFormat/>
+    <w:rsid w:val="00837EEC"/>
+    <w:pPr>
+      <w:keepNext/>
+      <w:keepLines/>
+      <w:numPr>
+        <w:ilvl w:val="8"/>
+        <w:numId w:val="8"/>
+      </w:numPr>
+      <w:spacing w:before="40" w:after="0"/>
+      <w:outlineLvl w:val="8"/>
+    </w:pPr>
+    <w:rPr>
+      <w:rFonts w:asciiTheme="majorHAnsi" w:eastAsiaTheme="majorEastAsia" w:hAnsiTheme="majorHAnsi" w:cstheme="majorBidi"/>
+      <w:i/>
+      <w:iCs/>
+      <w:color w:val="272727" w:themeColor="text1" w:themeTint="D8"/>
+      <w:sz w:val="21"/>
+      <w:szCs w:val="21"/>
     </w:rPr>
   </w:style>
   <w:style w:type="character" w:default="1" w:styleId="DefaultParagraphFont">
@@ -2051,6 +4590,340 @@
     <w:rPr>
       <w:rFonts w:ascii="Times New Roman" w:eastAsia="Times New Roman" w:hAnsi="Times New Roman" w:cs="Times New Roman"/>
       <w:szCs w:val="24"/>
+    </w:rPr>
+  </w:style>
+  <w:style w:type="paragraph" w:styleId="HTMLPreformatted">
+    <w:name w:val="HTML Preformatted"/>
+    <w:basedOn w:val="Normal"/>
+    <w:link w:val="HTMLPreformattedChar"/>
+    <w:uiPriority w:val="99"/>
+    <w:semiHidden/>
+    <w:unhideWhenUsed/>
+    <w:rsid w:val="00457DC1"/>
+    <w:pPr>
+      <w:tabs>
+        <w:tab w:val="left" w:pos="916"/>
+        <w:tab w:val="left" w:pos="1832"/>
+        <w:tab w:val="left" w:pos="2748"/>
+        <w:tab w:val="left" w:pos="3664"/>
+        <w:tab w:val="left" w:pos="4580"/>
+        <w:tab w:val="left" w:pos="5496"/>
+        <w:tab w:val="left" w:pos="6412"/>
+        <w:tab w:val="left" w:pos="7328"/>
+        <w:tab w:val="left" w:pos="8244"/>
+        <w:tab w:val="left" w:pos="9160"/>
+        <w:tab w:val="left" w:pos="10076"/>
+        <w:tab w:val="left" w:pos="10992"/>
+        <w:tab w:val="left" w:pos="11908"/>
+        <w:tab w:val="left" w:pos="12824"/>
+        <w:tab w:val="left" w:pos="13740"/>
+        <w:tab w:val="left" w:pos="14656"/>
+      </w:tabs>
+      <w:spacing w:after="0" w:line="240" w:lineRule="auto"/>
+    </w:pPr>
+    <w:rPr>
+      <w:rFonts w:ascii="Courier New" w:eastAsia="Times New Roman" w:hAnsi="Courier New" w:cs="Courier New"/>
+      <w:sz w:val="20"/>
+      <w:szCs w:val="20"/>
+    </w:rPr>
+  </w:style>
+  <w:style w:type="character" w:customStyle="1" w:styleId="HTMLPreformattedChar">
+    <w:name w:val="HTML Preformatted Char"/>
+    <w:basedOn w:val="DefaultParagraphFont"/>
+    <w:link w:val="HTMLPreformatted"/>
+    <w:uiPriority w:val="99"/>
+    <w:semiHidden/>
+    <w:rsid w:val="00457DC1"/>
+    <w:rPr>
+      <w:rFonts w:ascii="Courier New" w:eastAsia="Times New Roman" w:hAnsi="Courier New" w:cs="Courier New"/>
+      <w:sz w:val="20"/>
+      <w:szCs w:val="20"/>
+    </w:rPr>
+  </w:style>
+  <w:style w:type="character" w:customStyle="1" w:styleId="y2iqfc">
+    <w:name w:val="y2iqfc"/>
+    <w:basedOn w:val="DefaultParagraphFont"/>
+    <w:rsid w:val="00457DC1"/>
+  </w:style>
+  <w:style w:type="paragraph" w:styleId="TOCHeading">
+    <w:name w:val="TOC Heading"/>
+    <w:basedOn w:val="Heading1"/>
+    <w:next w:val="Normal"/>
+    <w:uiPriority w:val="39"/>
+    <w:unhideWhenUsed/>
+    <w:qFormat/>
+    <w:rsid w:val="00457DC1"/>
+    <w:pPr>
+      <w:outlineLvl w:val="9"/>
+    </w:pPr>
+  </w:style>
+  <w:style w:type="paragraph" w:styleId="TOC1">
+    <w:name w:val="toc 1"/>
+    <w:basedOn w:val="Normal"/>
+    <w:next w:val="Normal"/>
+    <w:autoRedefine/>
+    <w:uiPriority w:val="39"/>
+    <w:unhideWhenUsed/>
+    <w:rsid w:val="00457DC1"/>
+    <w:pPr>
+      <w:spacing w:before="120" w:after="0"/>
+    </w:pPr>
+    <w:rPr>
+      <w:rFonts w:asciiTheme="minorHAnsi" w:hAnsiTheme="minorHAnsi" w:cstheme="minorHAnsi"/>
+      <w:b/>
+      <w:bCs/>
+      <w:i/>
+      <w:iCs/>
+      <w:szCs w:val="24"/>
+    </w:rPr>
+  </w:style>
+  <w:style w:type="character" w:styleId="Hyperlink">
+    <w:name w:val="Hyperlink"/>
+    <w:basedOn w:val="DefaultParagraphFont"/>
+    <w:uiPriority w:val="99"/>
+    <w:unhideWhenUsed/>
+    <w:rsid w:val="00457DC1"/>
+    <w:rPr>
+      <w:color w:val="0563C1" w:themeColor="hyperlink"/>
+      <w:u w:val="single"/>
+    </w:rPr>
+  </w:style>
+  <w:style w:type="paragraph" w:styleId="TOC2">
+    <w:name w:val="toc 2"/>
+    <w:basedOn w:val="Normal"/>
+    <w:next w:val="Normal"/>
+    <w:autoRedefine/>
+    <w:uiPriority w:val="39"/>
+    <w:unhideWhenUsed/>
+    <w:rsid w:val="00457DC1"/>
+    <w:pPr>
+      <w:spacing w:before="120" w:after="0"/>
+      <w:ind w:left="240"/>
+    </w:pPr>
+    <w:rPr>
+      <w:rFonts w:asciiTheme="minorHAnsi" w:hAnsiTheme="minorHAnsi" w:cstheme="minorHAnsi"/>
+      <w:b/>
+      <w:bCs/>
+      <w:sz w:val="22"/>
+    </w:rPr>
+  </w:style>
+  <w:style w:type="paragraph" w:styleId="TOC3">
+    <w:name w:val="toc 3"/>
+    <w:basedOn w:val="Normal"/>
+    <w:next w:val="Normal"/>
+    <w:autoRedefine/>
+    <w:uiPriority w:val="39"/>
+    <w:semiHidden/>
+    <w:unhideWhenUsed/>
+    <w:rsid w:val="00457DC1"/>
+    <w:pPr>
+      <w:spacing w:after="0"/>
+      <w:ind w:left="480"/>
+    </w:pPr>
+    <w:rPr>
+      <w:rFonts w:asciiTheme="minorHAnsi" w:hAnsiTheme="minorHAnsi" w:cstheme="minorHAnsi"/>
+      <w:sz w:val="20"/>
+      <w:szCs w:val="20"/>
+    </w:rPr>
+  </w:style>
+  <w:style w:type="paragraph" w:styleId="TOC4">
+    <w:name w:val="toc 4"/>
+    <w:basedOn w:val="Normal"/>
+    <w:next w:val="Normal"/>
+    <w:autoRedefine/>
+    <w:uiPriority w:val="39"/>
+    <w:semiHidden/>
+    <w:unhideWhenUsed/>
+    <w:rsid w:val="00457DC1"/>
+    <w:pPr>
+      <w:spacing w:after="0"/>
+      <w:ind w:left="720"/>
+    </w:pPr>
+    <w:rPr>
+      <w:rFonts w:asciiTheme="minorHAnsi" w:hAnsiTheme="minorHAnsi" w:cstheme="minorHAnsi"/>
+      <w:sz w:val="20"/>
+      <w:szCs w:val="20"/>
+    </w:rPr>
+  </w:style>
+  <w:style w:type="paragraph" w:styleId="TOC5">
+    <w:name w:val="toc 5"/>
+    <w:basedOn w:val="Normal"/>
+    <w:next w:val="Normal"/>
+    <w:autoRedefine/>
+    <w:uiPriority w:val="39"/>
+    <w:semiHidden/>
+    <w:unhideWhenUsed/>
+    <w:rsid w:val="00457DC1"/>
+    <w:pPr>
+      <w:spacing w:after="0"/>
+      <w:ind w:left="960"/>
+    </w:pPr>
+    <w:rPr>
+      <w:rFonts w:asciiTheme="minorHAnsi" w:hAnsiTheme="minorHAnsi" w:cstheme="minorHAnsi"/>
+      <w:sz w:val="20"/>
+      <w:szCs w:val="20"/>
+    </w:rPr>
+  </w:style>
+  <w:style w:type="paragraph" w:styleId="TOC6">
+    <w:name w:val="toc 6"/>
+    <w:basedOn w:val="Normal"/>
+    <w:next w:val="Normal"/>
+    <w:autoRedefine/>
+    <w:uiPriority w:val="39"/>
+    <w:semiHidden/>
+    <w:unhideWhenUsed/>
+    <w:rsid w:val="00457DC1"/>
+    <w:pPr>
+      <w:spacing w:after="0"/>
+      <w:ind w:left="1200"/>
+    </w:pPr>
+    <w:rPr>
+      <w:rFonts w:asciiTheme="minorHAnsi" w:hAnsiTheme="minorHAnsi" w:cstheme="minorHAnsi"/>
+      <w:sz w:val="20"/>
+      <w:szCs w:val="20"/>
+    </w:rPr>
+  </w:style>
+  <w:style w:type="paragraph" w:styleId="TOC7">
+    <w:name w:val="toc 7"/>
+    <w:basedOn w:val="Normal"/>
+    <w:next w:val="Normal"/>
+    <w:autoRedefine/>
+    <w:uiPriority w:val="39"/>
+    <w:semiHidden/>
+    <w:unhideWhenUsed/>
+    <w:rsid w:val="00457DC1"/>
+    <w:pPr>
+      <w:spacing w:after="0"/>
+      <w:ind w:left="1440"/>
+    </w:pPr>
+    <w:rPr>
+      <w:rFonts w:asciiTheme="minorHAnsi" w:hAnsiTheme="minorHAnsi" w:cstheme="minorHAnsi"/>
+      <w:sz w:val="20"/>
+      <w:szCs w:val="20"/>
+    </w:rPr>
+  </w:style>
+  <w:style w:type="paragraph" w:styleId="TOC8">
+    <w:name w:val="toc 8"/>
+    <w:basedOn w:val="Normal"/>
+    <w:next w:val="Normal"/>
+    <w:autoRedefine/>
+    <w:uiPriority w:val="39"/>
+    <w:semiHidden/>
+    <w:unhideWhenUsed/>
+    <w:rsid w:val="00457DC1"/>
+    <w:pPr>
+      <w:spacing w:after="0"/>
+      <w:ind w:left="1680"/>
+    </w:pPr>
+    <w:rPr>
+      <w:rFonts w:asciiTheme="minorHAnsi" w:hAnsiTheme="minorHAnsi" w:cstheme="minorHAnsi"/>
+      <w:sz w:val="20"/>
+      <w:szCs w:val="20"/>
+    </w:rPr>
+  </w:style>
+  <w:style w:type="paragraph" w:styleId="TOC9">
+    <w:name w:val="toc 9"/>
+    <w:basedOn w:val="Normal"/>
+    <w:next w:val="Normal"/>
+    <w:autoRedefine/>
+    <w:uiPriority w:val="39"/>
+    <w:semiHidden/>
+    <w:unhideWhenUsed/>
+    <w:rsid w:val="00457DC1"/>
+    <w:pPr>
+      <w:spacing w:after="0"/>
+      <w:ind w:left="1920"/>
+    </w:pPr>
+    <w:rPr>
+      <w:rFonts w:asciiTheme="minorHAnsi" w:hAnsiTheme="minorHAnsi" w:cstheme="minorHAnsi"/>
+      <w:sz w:val="20"/>
+      <w:szCs w:val="20"/>
+    </w:rPr>
+  </w:style>
+  <w:style w:type="character" w:customStyle="1" w:styleId="Heading4Char">
+    <w:name w:val="Heading 4 Char"/>
+    <w:basedOn w:val="DefaultParagraphFont"/>
+    <w:link w:val="Heading4"/>
+    <w:uiPriority w:val="9"/>
+    <w:semiHidden/>
+    <w:rsid w:val="00837EEC"/>
+    <w:rPr>
+      <w:rFonts w:asciiTheme="majorHAnsi" w:eastAsiaTheme="majorEastAsia" w:hAnsiTheme="majorHAnsi" w:cstheme="majorBidi"/>
+      <w:i/>
+      <w:iCs/>
+      <w:color w:val="2E74B5" w:themeColor="accent1" w:themeShade="BF"/>
+      <w:sz w:val="24"/>
+    </w:rPr>
+  </w:style>
+  <w:style w:type="character" w:customStyle="1" w:styleId="Heading5Char">
+    <w:name w:val="Heading 5 Char"/>
+    <w:basedOn w:val="DefaultParagraphFont"/>
+    <w:link w:val="Heading5"/>
+    <w:uiPriority w:val="9"/>
+    <w:semiHidden/>
+    <w:rsid w:val="00837EEC"/>
+    <w:rPr>
+      <w:rFonts w:asciiTheme="majorHAnsi" w:eastAsiaTheme="majorEastAsia" w:hAnsiTheme="majorHAnsi" w:cstheme="majorBidi"/>
+      <w:color w:val="2E74B5" w:themeColor="accent1" w:themeShade="BF"/>
+      <w:sz w:val="24"/>
+    </w:rPr>
+  </w:style>
+  <w:style w:type="character" w:customStyle="1" w:styleId="Heading6Char">
+    <w:name w:val="Heading 6 Char"/>
+    <w:basedOn w:val="DefaultParagraphFont"/>
+    <w:link w:val="Heading6"/>
+    <w:uiPriority w:val="9"/>
+    <w:semiHidden/>
+    <w:rsid w:val="00837EEC"/>
+    <w:rPr>
+      <w:rFonts w:asciiTheme="majorHAnsi" w:eastAsiaTheme="majorEastAsia" w:hAnsiTheme="majorHAnsi" w:cstheme="majorBidi"/>
+      <w:color w:val="1F4D78" w:themeColor="accent1" w:themeShade="7F"/>
+      <w:sz w:val="24"/>
+    </w:rPr>
+  </w:style>
+  <w:style w:type="character" w:customStyle="1" w:styleId="Heading7Char">
+    <w:name w:val="Heading 7 Char"/>
+    <w:basedOn w:val="DefaultParagraphFont"/>
+    <w:link w:val="Heading7"/>
+    <w:uiPriority w:val="9"/>
+    <w:semiHidden/>
+    <w:rsid w:val="00837EEC"/>
+    <w:rPr>
+      <w:rFonts w:asciiTheme="majorHAnsi" w:eastAsiaTheme="majorEastAsia" w:hAnsiTheme="majorHAnsi" w:cstheme="majorBidi"/>
+      <w:i/>
+      <w:iCs/>
+      <w:color w:val="1F4D78" w:themeColor="accent1" w:themeShade="7F"/>
+      <w:sz w:val="24"/>
+    </w:rPr>
+  </w:style>
+  <w:style w:type="character" w:customStyle="1" w:styleId="Heading8Char">
+    <w:name w:val="Heading 8 Char"/>
+    <w:basedOn w:val="DefaultParagraphFont"/>
+    <w:link w:val="Heading8"/>
+    <w:uiPriority w:val="9"/>
+    <w:semiHidden/>
+    <w:rsid w:val="00837EEC"/>
+    <w:rPr>
+      <w:rFonts w:asciiTheme="majorHAnsi" w:eastAsiaTheme="majorEastAsia" w:hAnsiTheme="majorHAnsi" w:cstheme="majorBidi"/>
+      <w:color w:val="272727" w:themeColor="text1" w:themeTint="D8"/>
+      <w:sz w:val="21"/>
+      <w:szCs w:val="21"/>
+    </w:rPr>
+  </w:style>
+  <w:style w:type="character" w:customStyle="1" w:styleId="Heading9Char">
+    <w:name w:val="Heading 9 Char"/>
+    <w:basedOn w:val="DefaultParagraphFont"/>
+    <w:link w:val="Heading9"/>
+    <w:uiPriority w:val="9"/>
+    <w:semiHidden/>
+    <w:rsid w:val="00837EEC"/>
+    <w:rPr>
+      <w:rFonts w:asciiTheme="majorHAnsi" w:eastAsiaTheme="majorEastAsia" w:hAnsiTheme="majorHAnsi" w:cstheme="majorBidi"/>
+      <w:i/>
+      <w:iCs/>
+      <w:color w:val="272727" w:themeColor="text1" w:themeTint="D8"/>
+      <w:sz w:val="21"/>
+      <w:szCs w:val="21"/>
     </w:rPr>
   </w:style>
 </w:styles>

</xml_diff>